<commit_message>
chore: organise documentation and improve portfolio presentation
</commit_message>
<xml_diff>
--- a/docs/dissertation/Health_Risk_Dashboard_Dissertation.docx
+++ b/docs/dissertation/Health_Risk_Dashboard_Dissertation.docx
@@ -103,7 +103,7 @@
         <w:rPr>
           <w:sz w:val="23"/>
         </w:rPr>
-        <w:t>Continuous health data can support earlier recognition of deterioration, but a useful monitoring system must combine timely information with strict access control, intelligible evidence and safe failure behaviour. This dissertation presents the design, implementation and retrospective evaluation of the Health Risk Dashboard, a full-stack research prototype for patients, doctors, nurses and administrators. The system combines a React and TypeScript interface, a FastAPI service, PostgreSQL persistence, Redis-assisted notification broadcasting, WebSocket updates, wearable integration, deterministic clinical thresholds, a calibrated machine-learning pipeline and a constrained Groq-assisted clinical summarisation service. Development followed an iterative, risk-led methodology in which privacy boundaries and deterministic escalation were treated as primary requirements. The retrospective model predicts a critical vital-sign event within six hours using PhysioNet/CinC Challenge 2012 data. On the internal test set it achieved a ROC-AUC of 0.833 and sensitivity of 0.724, but precision was only 0.038, demonstrating a substantial false-positive and alert-fatigue risk. External Set B performance showed a ROC-AUC of 0.785 and sensitivity of 0.724. The implementation therefore supports shadow operation, drift monitoring, structured evidence, SHAP explanations and automatic suspension rather than presenting the model as autonomous diagnosis. Fifty backend tests, fifteen passing browser checks, static analysis, production builds and automated accessibility tests provided engineering assurance. However, prospective clinical validation, representative outpatient validation, completed human usability evaluation, clinical effectiveness and regulatory approval remain outstanding. The work demonstrates that responsible health-AI engineering depends as much on governance, traceability and honest limitation reporting as on predictive discrimination.</w:t>
+        <w:t>Continuous health data can support earlier recognition of deterioration, but a useful monitoring system must combine timely information with strict access control, intelligible evidence and safe failure behaviour. This dissertation presents the design, implementation and retrospective evaluation of the Health Risk Dashboard, a full-stack research prototype for patients, doctors, nurses and administrators. The system combines a React and TypeScript interface, a FastAPI service, PostgreSQL persistence, Redis-assisted notification broadcasting, WebSocket updates, wearable integration, deterministic clinical thresholds, a calibrated machine-learning pipeline and a constrained Groq-assisted clinical summarisation service. Development followed an iterative, risk-led methodology in which privacy boundaries and deterministic escalation were treated as primary requirements. The retrospective model predicts a critical vital-sign event within six hours using PhysioNet/CinC Challenge 2012 data. On the internal test set it achieved a ROC-AUC of 0.833 and sensitivity of 0.724, but precision was only 0.038, demonstrating a substantial false-positive and alert-fatigue risk. External Set B performance showed a ROC-AUC of 0.785 and sensitivity of 0.724. The implementation therefore supports shadow operation, drift monitoring, structured evidence, SHAP explanations and automatic suspension rather than presenting the model as autonomous diagnosis. Fifty backend tests, a successful frontend production build and lint, and browser/accessibility test infrastructure provide engineering evidence; the latest browser rerun also exposed unresolved development-server timing failures that require correction. Prospective clinical validation, representative outpatient validation, completed human usability evaluation, clinical effectiveness and regulatory approval remain outstanding. The work demonstrates that responsible health-AI engineering depends as much on governance, traceability and honest limitation reporting as on predictive discrimination.</w:t>
       </w:r>
     </w:p>
     <w:p>
@@ -282,6 +282,397 @@
         <w:t>Appendix A: Reproducibility Checklist</w:t>
         <w:tab/>
         <w:t>52</w:t>
+      </w:r>
+    </w:p>
+    <w:p>
+      <w:pPr>
+        <w:pStyle w:val="Heading1"/>
+      </w:pPr>
+      <w:r>
+        <w:t>List of Figures</w:t>
+      </w:r>
+    </w:p>
+    <w:p>
+      <w:pPr>
+        <w:spacing w:after="80"/>
+        <w:ind w:firstLine="0"/>
+      </w:pPr>
+      <w:r>
+        <w:rPr>
+          <w:b/>
+        </w:rPr>
+        <w:t xml:space="preserve">Figure 4.1  </w:t>
+      </w:r>
+      <w:r>
+        <w:t>Layered architecture of the Health Risk Dashboard</w:t>
+      </w:r>
+    </w:p>
+    <w:p>
+      <w:pPr>
+        <w:spacing w:after="80"/>
+        <w:ind w:firstLine="0"/>
+      </w:pPr>
+      <w:r>
+        <w:rPr>
+          <w:b/>
+        </w:rPr>
+        <w:t xml:space="preserve">Figure 4.2  </w:t>
+      </w:r>
+      <w:r>
+        <w:t>Role and patient-access boundary</w:t>
+      </w:r>
+    </w:p>
+    <w:p>
+      <w:pPr>
+        <w:spacing w:after="80"/>
+        <w:ind w:firstLine="0"/>
+      </w:pPr>
+      <w:r>
+        <w:rPr>
+          <w:b/>
+        </w:rPr>
+        <w:t xml:space="preserve">Figure 4.3  </w:t>
+      </w:r>
+      <w:r>
+        <w:t>Observation-to-alert data flow</w:t>
+      </w:r>
+    </w:p>
+    <w:p>
+      <w:pPr>
+        <w:spacing w:after="80"/>
+        <w:ind w:firstLine="0"/>
+      </w:pPr>
+      <w:r>
+        <w:rPr>
+          <w:b/>
+        </w:rPr>
+        <w:t xml:space="preserve">Figure 4.4  </w:t>
+      </w:r>
+      <w:r>
+        <w:t>Evidence-bound AI assistant pipeline</w:t>
+      </w:r>
+    </w:p>
+    <w:p>
+      <w:pPr>
+        <w:spacing w:after="80"/>
+        <w:ind w:firstLine="0"/>
+      </w:pPr>
+      <w:r>
+        <w:rPr>
+          <w:b/>
+        </w:rPr>
+        <w:t xml:space="preserve">Figure 4.5  </w:t>
+      </w:r>
+      <w:r>
+        <w:t>Production deployment topology</w:t>
+      </w:r>
+    </w:p>
+    <w:p>
+      <w:pPr>
+        <w:spacing w:after="80"/>
+        <w:ind w:firstLine="0"/>
+      </w:pPr>
+      <w:r>
+        <w:rPr>
+          <w:b/>
+        </w:rPr>
+        <w:t xml:space="preserve">Figure 5.1  </w:t>
+      </w:r>
+      <w:r>
+        <w:t>Doctor dashboard displaying an assigned patient and current observations</w:t>
+      </w:r>
+    </w:p>
+    <w:p>
+      <w:pPr>
+        <w:spacing w:after="80"/>
+        <w:ind w:firstLine="0"/>
+      </w:pPr>
+      <w:r>
+        <w:rPr>
+          <w:b/>
+        </w:rPr>
+        <w:t xml:space="preserve">Figure 5.2  </w:t>
+      </w:r>
+      <w:r>
+        <w:t>Nurse dashboard organised around bedside care activities</w:t>
+      </w:r>
+    </w:p>
+    <w:p>
+      <w:pPr>
+        <w:spacing w:after="80"/>
+        <w:ind w:firstLine="0"/>
+      </w:pPr>
+      <w:r>
+        <w:rPr>
+          <w:b/>
+        </w:rPr>
+        <w:t xml:space="preserve">Figure 5.3  </w:t>
+      </w:r>
+      <w:r>
+        <w:t>Administrator dashboard for non-clinical platform governance</w:t>
+      </w:r>
+    </w:p>
+    <w:p>
+      <w:pPr>
+        <w:spacing w:after="80"/>
+        <w:ind w:firstLine="0"/>
+      </w:pPr>
+      <w:r>
+        <w:rPr>
+          <w:b/>
+        </w:rPr>
+        <w:t xml:space="preserve">Figure 5.4  </w:t>
+      </w:r>
+      <w:r>
+        <w:t>Notification centre with unread inbox and retained history</w:t>
+      </w:r>
+    </w:p>
+    <w:p>
+      <w:pPr>
+        <w:spacing w:after="80"/>
+        <w:ind w:firstLine="0"/>
+      </w:pPr>
+      <w:r>
+        <w:rPr>
+          <w:b/>
+        </w:rPr>
+        <w:t xml:space="preserve">Figure 5.5  </w:t>
+      </w:r>
+      <w:r>
+        <w:t>Reproducible machine-learning lifecycle</w:t>
+      </w:r>
+    </w:p>
+    <w:p>
+      <w:pPr>
+        <w:spacing w:after="80"/>
+        <w:ind w:firstLine="0"/>
+      </w:pPr>
+      <w:r>
+        <w:rPr>
+          <w:b/>
+        </w:rPr>
+        <w:t xml:space="preserve">Figure 5.6  </w:t>
+      </w:r>
+      <w:r>
+        <w:t>Trained six-hour model output with probability and provenance</w:t>
+      </w:r>
+    </w:p>
+    <w:p>
+      <w:pPr>
+        <w:spacing w:after="80"/>
+        <w:ind w:firstLine="0"/>
+      </w:pPr>
+      <w:r>
+        <w:rPr>
+          <w:b/>
+        </w:rPr>
+        <w:t xml:space="preserve">Figure 5.7  </w:t>
+      </w:r>
+      <w:r>
+        <w:t>Restricted research evidence workspace</w:t>
+      </w:r>
+    </w:p>
+    <w:p>
+      <w:pPr>
+        <w:spacing w:after="80"/>
+        <w:ind w:firstLine="0"/>
+      </w:pPr>
+      <w:r>
+        <w:rPr>
+          <w:b/>
+        </w:rPr>
+        <w:t xml:space="preserve">Figure 5.8  </w:t>
+      </w:r>
+      <w:r>
+        <w:t>Evidence-linked clinician Groq AI Assistant</w:t>
+      </w:r>
+    </w:p>
+    <w:p>
+      <w:pPr>
+        <w:spacing w:after="80"/>
+        <w:ind w:firstLine="0"/>
+      </w:pPr>
+      <w:r>
+        <w:rPr>
+          <w:b/>
+        </w:rPr>
+        <w:t xml:space="preserve">Figure 5.9  </w:t>
+      </w:r>
+      <w:r>
+        <w:t>Responsive authentication interface</w:t>
+      </w:r>
+    </w:p>
+    <w:p>
+      <w:pPr>
+        <w:spacing w:after="80"/>
+        <w:ind w:firstLine="0"/>
+      </w:pPr>
+      <w:r>
+        <w:rPr>
+          <w:b/>
+        </w:rPr>
+        <w:t xml:space="preserve">Figure 6.1  </w:t>
+      </w:r>
+      <w:r>
+        <w:t>Candidate-model performance on the validation partition</w:t>
+      </w:r>
+    </w:p>
+    <w:p>
+      <w:pPr>
+        <w:spacing w:after="80"/>
+        <w:ind w:firstLine="0"/>
+      </w:pPr>
+      <w:r>
+        <w:rPr>
+          <w:b/>
+        </w:rPr>
+        <w:t xml:space="preserve">Figure 6.2  </w:t>
+      </w:r>
+      <w:r>
+        <w:t>Internal test confusion matrix at the 0.014 threshold</w:t>
+      </w:r>
+    </w:p>
+    <w:p>
+      <w:pPr>
+        <w:spacing w:after="80"/>
+        <w:ind w:firstLine="0"/>
+      </w:pPr>
+      <w:r>
+        <w:rPr>
+          <w:b/>
+        </w:rPr>
+        <w:t xml:space="preserve">Figure 6.3  </w:t>
+      </w:r>
+      <w:r>
+        <w:t>Internal test calibration plot</w:t>
+      </w:r>
+    </w:p>
+    <w:p>
+      <w:pPr>
+        <w:spacing w:after="80"/>
+        <w:ind w:firstLine="0"/>
+      </w:pPr>
+      <w:r>
+        <w:rPr>
+          <w:b/>
+        </w:rPr>
+        <w:t xml:space="preserve">Figure 6.4  </w:t>
+      </w:r>
+      <w:r>
+        <w:t>Internal test and external Set B metric comparison</w:t>
+      </w:r>
+    </w:p>
+    <w:p>
+      <w:pPr>
+        <w:spacing w:after="80"/>
+        <w:ind w:firstLine="0"/>
+      </w:pPr>
+      <w:r>
+        <w:rPr>
+          <w:b/>
+        </w:rPr>
+        <w:t xml:space="preserve">Figure 6.5  </w:t>
+      </w:r>
+      <w:r>
+        <w:t>Global SHAP feature influence in the evaluation sample</w:t>
+      </w:r>
+    </w:p>
+    <w:p>
+      <w:pPr>
+        <w:pStyle w:val="Heading1"/>
+      </w:pPr>
+      <w:r>
+        <w:t>List of Tables</w:t>
+      </w:r>
+    </w:p>
+    <w:p>
+      <w:pPr>
+        <w:spacing w:after="80"/>
+        <w:ind w:firstLine="0"/>
+      </w:pPr>
+      <w:r>
+        <w:rPr>
+          <w:b/>
+        </w:rPr>
+        <w:t xml:space="preserve">Table 3.1  </w:t>
+      </w:r>
+      <w:r>
+        <w:t>Principal functional requirements</w:t>
+      </w:r>
+    </w:p>
+    <w:p>
+      <w:pPr>
+        <w:spacing w:after="80"/>
+        <w:ind w:firstLine="0"/>
+      </w:pPr>
+      <w:r>
+        <w:rPr>
+          <w:b/>
+        </w:rPr>
+        <w:t xml:space="preserve">Table 4.1  </w:t>
+      </w:r>
+      <w:r>
+        <w:t>Logical layers of the Health Risk Dashboard</w:t>
+      </w:r>
+    </w:p>
+    <w:p>
+      <w:pPr>
+        <w:spacing w:after="80"/>
+        <w:ind w:firstLine="0"/>
+      </w:pPr>
+      <w:r>
+        <w:rPr>
+          <w:b/>
+        </w:rPr>
+        <w:t xml:space="preserve">Table 4.2  </w:t>
+      </w:r>
+      <w:r>
+        <w:t>Summary threat model</w:t>
+      </w:r>
+    </w:p>
+    <w:p>
+      <w:pPr>
+        <w:spacing w:after="80"/>
+        <w:ind w:firstLine="0"/>
+      </w:pPr>
+      <w:r>
+        <w:rPr>
+          <w:b/>
+        </w:rPr>
+        <w:t xml:space="preserve">Table 6.1  </w:t>
+      </w:r>
+      <w:r>
+        <w:t>Final engineering verification summary</w:t>
+      </w:r>
+    </w:p>
+    <w:p>
+      <w:pPr>
+        <w:spacing w:after="80"/>
+        <w:ind w:firstLine="0"/>
+      </w:pPr>
+      <w:r>
+        <w:rPr>
+          <w:b/>
+        </w:rPr>
+        <w:t xml:space="preserve">Table 6.2  </w:t>
+      </w:r>
+      <w:r>
+        <w:t>Retrospective model performance at the selected operating threshold</w:t>
+      </w:r>
+    </w:p>
+    <w:p>
+      <w:pPr>
+        <w:spacing w:after="80"/>
+        <w:ind w:firstLine="0"/>
+      </w:pPr>
+      <w:r>
+        <w:rPr>
+          <w:b/>
+        </w:rPr>
+        <w:t xml:space="preserve">Table 6.3  </w:t>
+      </w:r>
+      <w:r>
+        <w:t>Evidence maturity and permitted conclusions</w:t>
       </w:r>
     </w:p>
     <w:p>
@@ -965,7 +1356,7 @@
         <w:widowControl/>
       </w:pPr>
       <w:r>
-        <w:t>Remote monitoring may support earlier attention, but benefits depend on service design. Noah et al. (2018) found that wearable biosensors can influence outcomes in some settings, although evidence varies by intervention and population. Technology adoption also depends on comfort, trust, digital literacy, connectivity and the capacity of staff to respond. Consequently, the dashboard includes failure states and operational monitoring rather than assuming that data availability guarantees action. WebSocket updates improve immediacy, while database persistence and polling recovery prevent the live channel from becoming the only source of truth.</w:t>
+        <w:t>Remote monitoring may support earlier attention, but benefits depend on service design. Noah et al. (2018) found that wearable biosensors can influence outcomes in some settings, although evidence varies by intervention and population. A more recent systematic review by Lu et al. (2023) likewise found substantial variation in technologies used to measure cardiovascular function among community-dwelling adults. This heterogeneity makes a simple claim that monitoring itself improves outcomes methodologically weak. Technology adoption also depends on comfort, trust, digital literacy, connectivity and the capacity of staff to respond. Consequently, the dashboard includes failure states and operational monitoring rather than assuming that data availability guarantees action. WebSocket updates improve immediacy, while database persistence and polling recovery prevent the live channel from becoming the only source of truth.</w:t>
       </w:r>
     </w:p>
     <w:p>
@@ -1085,7 +1476,7 @@
         <w:widowControl/>
       </w:pPr>
       <w:r>
-        <w:t>Explainability can itself mislead. Feature attributions may be unstable when variables are correlated, and an attractive chart can create unwarranted confidence in a weak model. The interface therefore pairs SHAP with probability, timeframe, model version, data quality, missing fields and deterministic status. Global SHAP figures are generated from recorded model evidence for dissertation analysis, not written manually. This improves reproducibility but does not eliminate the need for clinical interpretation and external validation.</w:t>
+        <w:t>Explainability can itself mislead. Ghassemi, Oakden-Rayner and Beam (2021) argue that many current explainability methods in health care can create a false sense of understanding without establishing that a model is safe or clinically valid. Feature attributions may also be unstable when variables are correlated, and an attractive chart can create unwarranted confidence in a weak model. The interface therefore pairs SHAP with probability, timeframe, model version, data quality, missing fields and deterministic status. Global SHAP figures are generated from recorded model evidence for dissertation analysis, not written manually. This improves reproducibility but does not turn association into causation or remove the need for clinical interpretation and external validation.</w:t>
       </w:r>
     </w:p>
     <w:p>
@@ -1101,7 +1492,7 @@
         <w:widowControl/>
       </w:pPr>
       <w:r>
-        <w:t>Large language models can summarise records, answer questions and reduce the effort required to navigate longitudinal data. Their fluent output, however, can obscure unsupported statements. The assistant in this project is designed around evidence-linked structure. Each response contains a summary, risk level, supporting evidence, missing information, recommended checks, escalation conditions, an evidence-support indicator and a safety warning. Evidence references an exact controlled record and timestamp. The provider output is validated against a strict schema, and a strong evidence-support value without matching evidence is rejected. This field describes support within the retrieved record; it is not a calibrated uncertainty estimate.</w:t>
+        <w:t>Large language models can summarise records, answer questions and reduce the effort required to navigate longitudinal data. Singhal et al. (2023) demonstrated substantial medical question-answering capability, but their human evaluation also identified limitations in factual grounding, harm and bias. Lee, Bubeck and Petro (2023) similarly distinguish promising language capability from evidence of safe clinical use. Fluent output can therefore obscure unsupported statements rather than remove uncertainty. The assistant in this project is designed around evidence-linked structure. Each response contains a summary, risk level, supporting evidence, missing information, recommended checks, escalation conditions, an evidence-support indicator and a safety warning. Evidence references an exact controlled record and timestamp. The provider output is validated against a strict schema, and a strong evidence-support value without matching evidence is rejected. This field describes support within the retrieved record; it is not a calibrated uncertainty estimate.</w:t>
       </w:r>
     </w:p>
     <w:p>
@@ -1197,7 +1588,7 @@
         <w:widowControl/>
       </w:pPr>
       <w:r>
-        <w:t>Governance extends beyond cybersecurity. NIST’s AI Risk Management Framework organises continuous activity around Govern, Map, Measure and Manage functions (Tabassi, 2023). The dashboard therefore contains an active model version, approval history, shadow/live selection, threshold controls, rollback, drift limits, automatic suspension and retirement reasons. Joint good-machine-learning-practice principles from the FDA, Health Canada and MHRA further emphasise representative datasets, independent test sets, human–AI team performance, clear user information and monitoring of deployed models (FDA, Health Canada and MHRA, 2021). Research records are separated from care workflows. Regulatory documentation states intended purpose and evidence gaps, but does not claim approval. This distinction is essential: software controls can prepare evidence, while a competent organisation and regulator determines whether the evidence is sufficient.</w:t>
+        <w:t>Governance extends beyond cybersecurity. NIST’s AI Risk Management Framework organises continuous activity around Govern, Map, Measure and Manage functions (Tabassi, 2023). The dashboard therefore contains an active model version, approval history, shadow/live selection, threshold controls, rollback, drift limits, automatic suspension and retirement reasons. Joint good-machine-learning-practice principles from the FDA, Health Canada and MHRA further emphasise representative datasets, independent test sets, human–AI team performance, clear user information and monitoring of deployed models (FDA, Health Canada and MHRA, 2021). The MHRA's current Software and AI as a Medical Device programme also shows that UK requirements continue to evolve; a prototype cannot infer regulatory status from technical functionality alone (MHRA, 2024). Research records are separated from care workflows. Regulatory documentation states intended purpose and evidence gaps, but does not claim approval. This distinction is essential: software controls can prepare evidence, while a competent organisation and regulator determines whether the evidence is sufficient.</w:t>
       </w:r>
     </w:p>
     <w:p>
@@ -1205,7 +1596,7 @@
         <w:widowControl/>
       </w:pPr>
       <w:r>
-        <w:t>Transparent reporting is also a design requirement. TRIPOD+AI requests explicit reporting of data sources, participant selection, missing data, model specification, evaluation and open-science materials for clinical prediction models (Collins et al., 2024). CONSORT-AI adds trial-reporting requirements when an AI intervention is evaluated prospectively, including the intended use, input data, human interaction and analysis of errors (Liu et al., 2020). The project’s model card, dataset hash, locked metrics, limitation statements and research workspace were aligned with this direction. They do not constitute compliance certification, but they make later evaluation more reproducible and less vulnerable to selective reporting.</w:t>
+        <w:t>Transparent reporting is also a design requirement. TRIPOD+AI requests explicit reporting of data sources, participant selection, missing data, model specification, evaluation and open-science materials for clinical prediction models (Collins et al., 2024). CONSORT-AI adds trial-reporting requirements when an AI intervention is evaluated prospectively, including the intended use, input data, human interaction and analysis of errors (Liu et al., 2020). DECIDE-AI addresses the earlier stage at which human factors, workflow integration and safety should be examined before a large comparative trial (Vasey et al., 2022). These guidelines serve different study stages; none converts retrospective software evaluation into clinical validation. The project’s model card, dataset hash, locked metrics, limitation statements and research workspace were aligned with this direction. They do not constitute compliance certification, but they make later evaluation more reproducible and less vulnerable to selective reporting.</w:t>
       </w:r>
     </w:p>
     <w:p>
@@ -1750,7 +2141,7 @@
         <w:widowControl/>
       </w:pPr>
       <w:r>
-        <w:t>The prediction target was defined before model selection. A row is positive when a qualifying critical vital event occurs in the following six-hour window. PhysioNet/CinC Challenge 2012 Set A was prepared into chronological patient records. The dataset was separated by patient into 17,920 training, 4,480 validation and 5,600 test records. Candidate logistic-regression and random-forest models were compared. Logistic regression was selected because its validation sensitivity aligned better with the chosen safety-oriented objective, despite the random forest’s superficially high accuracy at a default threshold.</w:t>
+        <w:t>The prediction target was defined before model selection. A row is positive when a qualifying critical vital event occurs in the following six-hour window. PhysioNet/CinC Challenge 2012 Set A was prepared into chronological patient records. The dataset was separated by patient into 17,920 training, 4,480 validation and 5,600 test records. Candidate class-weighted logistic-regression and random-forest pipelines were fitted to the training partition and compared on the validation partition. The training script selected the candidate with the highest validation ROC-AUC, using F1 only as a tie-breaker. Logistic regression was therefore selected because its validation ROC-AUC was 0.810, compared with 0.791 for random forest. Sensitivity was not the primary model-selection rule.</w:t>
       </w:r>
     </w:p>
     <w:p>
@@ -1758,7 +2149,7 @@
         <w:widowControl/>
       </w:pPr>
       <w:r>
-        <w:t>Feature engineering produced rolling means, standard deviations, deltas and slopes. Probability calibration and threshold selection were performed on validation data. The threshold was lowered to 0.014 to retain sensitivity, and the locked process was evaluated on the test set. Set B was used as a related external cohort. Isolation Forest and SHAP evidence were generated alongside the supervised classifier. Dataset hash, outcome definition, feature schema, metrics, reference distributions and limitations were stored with the versioned artifact.</w:t>
+        <w:t>Feature engineering produced rolling means, standard deviations, deltas and slopes. After candidate selection, sigmoid calibration was fitted with CalibratedClassifierCV on validation data. Threshold selection was a separate step: among candidate thresholds that achieved validation sensitivity of at least 0.70, the script maximised Youden's J statistic. This produced an operating threshold of 0.014 and intentionally traded specificity and precision for sensitivity. The resulting locked process was evaluated on the test set. Set B was used as a related external cohort without retraining. Isolation Forest was trained separately on negative training examples as an anomaly signal, and SHAP evidence was generated to describe feature influence. Dataset hash, outcome definition, feature schema, metrics, reference distributions and limitations were stored with the versioned artifact.</w:t>
       </w:r>
     </w:p>
     <w:p>
@@ -1766,7 +2157,7 @@
         <w:widowControl/>
       </w:pPr>
       <w:r>
-        <w:t>Reporting decisions were informed by TRIPOD+AI rather than by the best-looking metric alone (Collins et al., 2024). The dissertation therefore states the source population, outcome window, partition sizes, candidate algorithms, operating threshold, confusion matrix, discrimination, calibration, subgroup results and intended-use boundary. The distinction between model development, retrospective external validation and future prospective evaluation is maintained throughout.</w:t>
+        <w:t>The committed artifact is identified as model version physionet-critical-v1. Reporting decisions were informed by TRIPOD+AI rather than by the best-looking metric alone (Collins et al., 2024). The dissertation therefore states the source population, outcome window, partition sizes, candidate algorithms, operating threshold, confusion matrix, discrimination, calibration, subgroup results and intended-use boundary. The distinction between model development, retrospective external validation and future prospective evaluation is maintained throughout.</w:t>
       </w:r>
     </w:p>
     <w:p>
@@ -1865,7 +2256,7 @@
       <w:r>
         <w:drawing>
           <wp:inline xmlns:a="http://schemas.openxmlformats.org/drawingml/2006/main" xmlns:pic="http://schemas.openxmlformats.org/drawingml/2006/picture">
-            <wp:extent cx="5166360" cy="2836839"/>
+            <wp:extent cx="4480560" cy="2488948"/>
             <wp:docPr id="1" name="Picture 1" descr="Diagram showing data sources and the React client connected to FastAPI, PostgreSQL, live messaging, safety and intelligence, and operational services." title="Figure 4.1: Layered architecture of the Health Risk Dashboard."/>
             <wp:cNvGraphicFramePr>
               <a:graphicFrameLocks noChangeAspect="1"/>
@@ -1886,7 +2277,7 @@
                   <pic:spPr>
                     <a:xfrm>
                       <a:off x="0" y="0"/>
-                      <a:ext cx="5166360" cy="2836839"/>
+                      <a:ext cx="4480560" cy="2488948"/>
                     </a:xfrm>
                     <a:prstGeom prst="rect"/>
                   </pic:spPr>
@@ -2237,7 +2628,7 @@
         <w:widowControl/>
       </w:pPr>
       <w:r>
-        <w:t>React pages call a central API service that attaches an access token and handles refresh behaviour. FastAPI routes validate requests through Pydantic models, resolve the active user, apply role and assignment filters, and interact with SQLAlchemy sessions. PostgreSQL stores users, patients, assignments, observations, medications, events, notifications, audit entries, predictions and research evidence. Redis pub/sub supports broadcast across instances, while stored notification state and polling provide recovery. External systems include Withings, Groq, error reporting, object storage and managed hosting.</w:t>
+        <w:t>Figure 4.1 summarises how the presentation, application, persistence, messaging, intelligence and operational components are separated. React pages call a central API service that attaches an access token and handles refresh behaviour. FastAPI routes validate requests through Pydantic models, resolve the active user, apply role and assignment filters, and interact with SQLAlchemy sessions. PostgreSQL stores users, patients, assignments, observations, medications, events, notifications, audit entries, predictions and research evidence. Redis pub/sub supports broadcast across instances, while stored notification state and polling provide recovery. External systems include Withings, Groq, error reporting, object storage and managed hosting.</w:t>
       </w:r>
     </w:p>
     <w:p>
@@ -2256,7 +2647,7 @@
       <w:r>
         <w:drawing>
           <wp:inline xmlns:a="http://schemas.openxmlformats.org/drawingml/2006/main" xmlns:pic="http://schemas.openxmlformats.org/drawingml/2006/picture">
-            <wp:extent cx="5166360" cy="2810773"/>
+            <wp:extent cx="5230368" cy="2845597"/>
             <wp:docPr id="2" name="Picture 2" descr="Diagram showing patient, doctor, nurse and administrator requests passing through backend identity, role and assignment checks before clinical or administrative access." title="Figure 4.2: Role and patient-access boundary."/>
             <wp:cNvGraphicFramePr>
               <a:graphicFrameLocks noChangeAspect="1"/>
@@ -2277,7 +2668,7 @@
                   <pic:spPr>
                     <a:xfrm>
                       <a:off x="0" y="0"/>
-                      <a:ext cx="5166360" cy="2810773"/>
+                      <a:ext cx="5230368" cy="2845597"/>
                     </a:xfrm>
                     <a:prstGeom prst="rect"/>
                   </pic:spPr>
@@ -2305,7 +2696,7 @@
         <w:widowControl/>
       </w:pPr>
       <w:r>
-        <w:t>The trust model rejects the assumption that an authenticated user may access all records. An administrator may create users and assignments but cannot use normal patient-detail, vital, medication or Groq-assistant endpoints. A doctor or nurse receives accessible patient identifiers from active assignments and can switch only within that set. A patient query is constrained by the user identifier linked to the patient record. These rules are centralised in access-control functions so new routes can reuse the same policy.</w:t>
+        <w:t>Figure 4.2 places the backend policy boundary between every role and the protected records. The trust model rejects the assumption that an authenticated user may access all records. An administrator may create users and assignments but cannot use normal patient-detail, vital, medication or Groq-assistant endpoints. A doctor or nurse receives accessible patient identifiers from active assignments and can switch only within that set. A patient query is constrained by the user identifier linked to the patient record. These rules are centralised in access-control functions so new routes can reuse the same policy.</w:t>
       </w:r>
     </w:p>
     <w:p>
@@ -2356,7 +2747,7 @@
       <w:r>
         <w:drawing>
           <wp:inline xmlns:a="http://schemas.openxmlformats.org/drawingml/2006/main" xmlns:pic="http://schemas.openxmlformats.org/drawingml/2006/picture">
-            <wp:extent cx="5166360" cy="2370935"/>
+            <wp:extent cx="5230368" cy="2400309"/>
             <wp:docPr id="3" name="Picture 3" descr="Six-stage flow from receiving and validating a measurement through deduplication, persistence, deterministic safety evaluation and notification." title="Figure 4.3: Observation-to-alert data flow."/>
             <wp:cNvGraphicFramePr>
               <a:graphicFrameLocks noChangeAspect="1"/>
@@ -2377,7 +2768,7 @@
                   <pic:spPr>
                     <a:xfrm>
                       <a:off x="0" y="0"/>
-                      <a:ext cx="5166360" cy="2370935"/>
+                      <a:ext cx="5230368" cy="2400309"/>
                     </a:xfrm>
                     <a:prstGeom prst="rect"/>
                   </pic:spPr>
@@ -2405,7 +2796,7 @@
         <w:widowControl/>
       </w:pPr>
       <w:r>
-        <w:t>A measurement enters through a validated API, simulator or integration webhook. The integration checks identity and deduplicates repeated events before storing measurement and provenance. Deterministic safety evaluates actual critical values. When a threshold is crossed, an urgent structured alert is written and broadcast regardless of model availability. For a non-critical reading, the runtime may calculate features, drift distance, probability, anomaly status and SHAP contributions.</w:t>
+        <w:t>Figure 4.3 shows the ordering of persistence and safety evaluation in the observation path. A measurement enters through a validated API, simulator or integration webhook. The integration checks identity and deduplicates repeated events before storing measurement and provenance. Deterministic safety evaluates actual critical values. When a threshold is crossed, an urgent structured alert is written and broadcast regardless of model availability. For a non-critical reading, the runtime may calculate features, drift distance, probability, anomaly status and SHAP contributions.</w:t>
       </w:r>
     </w:p>
     <w:p>
@@ -2432,7 +2823,7 @@
       <w:r>
         <w:drawing>
           <wp:inline xmlns:a="http://schemas.openxmlformats.org/drawingml/2006/main" xmlns:pic="http://schemas.openxmlformats.org/drawingml/2006/picture">
-            <wp:extent cx="5166360" cy="2603887"/>
+            <wp:extent cx="5230368" cy="2636147"/>
             <wp:docPr id="4" name="Picture 4" descr="Pipeline showing authorised retrieval, an untrusted-data boundary, Groq generation, schema validation, safety rejection and evidence-linked presentation." title="Figure 4.4: Evidence-bound AI assistant pipeline."/>
             <wp:cNvGraphicFramePr>
               <a:graphicFrameLocks noChangeAspect="1"/>
@@ -2453,7 +2844,7 @@
                   <pic:spPr>
                     <a:xfrm>
                       <a:off x="0" y="0"/>
-                      <a:ext cx="5166360" cy="2603887"/>
+                      <a:ext cx="5230368" cy="2636147"/>
                     </a:xfrm>
                     <a:prstGeom prst="rect"/>
                   </pic:spPr>
@@ -2481,7 +2872,7 @@
         <w:widowControl/>
       </w:pPr>
       <w:r>
-        <w:t>The Groq AI Assistant follows a retrieve-validate-present pattern. The server retrieves only data the current user may access and constructs controlled evidence objects with identifiers and timestamps. Patient notes are delimited as untrusted content. Groq is asked for a strict JSON-compatible structure, after which Pydantic validation and additional safety checks verify required fields, timestamps, evidence support and risk level. The interface describes the schema's numeric support field as an evidence-support indicator rather than model confidence. Provider-generated “Critical” classifications are rejected so that critical status remains deterministic.</w:t>
+        <w:t>Figure 4.4 shows the evidence and validation boundaries around the external provider. The Groq AI Assistant follows a retrieve-validate-present pattern. The server retrieves only data the current user may access and constructs controlled evidence objects with identifiers and timestamps. Patient notes are delimited as untrusted content. Groq is asked for a strict JSON-compatible structure, after which Pydantic validation and additional safety checks verify required fields, timestamps, evidence support and risk level. The interface describes the schema's numeric support field as an evidence-support indicator rather than model confidence. Provider-generated “Critical” classifications are rejected so that critical status remains deterministic.</w:t>
       </w:r>
     </w:p>
     <w:p>
@@ -2489,7 +2880,7 @@
         <w:widowControl/>
       </w:pPr>
       <w:r>
-        <w:t>Memory is partitioned by patient and encrypted using a dedicated key. Switching patient removes the active conversation to reduce contamination risk. Retry limits, a timeout, circuit breaker and daily cost boundary contain provider failure. A deterministic fallback produces an unavailable or evidence-limited response rather than a plausible fabrication. The interface presents source evidence, the evidence-support indicator, provider-model metadata, data freshness and a non-diagnostic warning.</w:t>
+        <w:t>Memory is partitioned by patient and encrypted using a dedicated key. Switching patient clears the previous patient's stored assistant memory and resets the visible conversation, reducing contamination risk. Retry limits, a timeout, circuit breaker and daily request boundary contain provider failure. A deterministic fallback produces an unavailable or evidence-limited response rather than a plausible fabrication. The interface presents source evidence, the evidence-support indicator, provider-model metadata, data freshness and a non-diagnostic warning.</w:t>
       </w:r>
     </w:p>
     <w:p>
@@ -2532,7 +2923,7 @@
       <w:r>
         <w:drawing>
           <wp:inline xmlns:a="http://schemas.openxmlformats.org/drawingml/2006/main" xmlns:pic="http://schemas.openxmlformats.org/drawingml/2006/picture">
-            <wp:extent cx="5166360" cy="2861981"/>
+            <wp:extent cx="5230368" cy="2897440"/>
             <wp:docPr id="5" name="Picture 5" descr="Diagram showing a Vercel frontend, Render FastAPI service, Aiven PostgreSQL database, Redis and external Groq, Withings and Sentry services." title="Figure 4.5: Production deployment topology."/>
             <wp:cNvGraphicFramePr>
               <a:graphicFrameLocks noChangeAspect="1"/>
@@ -2553,7 +2944,7 @@
                   <pic:spPr>
                     <a:xfrm>
                       <a:off x="0" y="0"/>
-                      <a:ext cx="5166360" cy="2861981"/>
+                      <a:ext cx="5230368" cy="2897440"/>
                     </a:xfrm>
                     <a:prstGeom prst="rect"/>
                   </pic:spPr>
@@ -2581,7 +2972,7 @@
         <w:widowControl/>
       </w:pPr>
       <w:r>
-        <w:t>The frontend is suitable for a static platform such as Vercel and reads the backend origin from an environment variable. The FastAPI service uses managed PostgreSQL through a TLS connection and exposes live and ready endpoints. Readiness verifies database access rather than merely confirming that the process exists. Startup waits for the database, applies Alembic migrations and then launches the server. Connection pool size and overflow are deliberately limited for small managed plans.</w:t>
+        <w:t>Figure 4.5 presents the intended hosted topology rather than evidence that every external service is currently enabled. The frontend is suitable for a static platform such as Vercel and reads the backend origin from an environment variable. The FastAPI service uses managed PostgreSQL through a TLS connection and exposes live and ready endpoints. Readiness verifies database access rather than merely confirming that the process exists. Startup waits for the database, applies Alembic migrations and then launches the server. Connection pool size and overflow are deliberately limited for small managed plans.</w:t>
       </w:r>
     </w:p>
     <w:p>
@@ -2589,7 +2980,7 @@
         <w:widowControl/>
       </w:pPr>
       <w:r>
-        <w:t>Production CORS allows only configured frontend origins. The CSP uses local fonts or explicitly trusted sources. Secrets are held in platform environment settings, not committed files. Redis is recommended for multi-instance notification broadcast and shared operational state. Error reporting, backup verification, health monitoring and deployment workflows supply operational evidence. An overdue-observation monitor can be enabled by an administrator to control hosting cost rather than running permanently.</w:t>
+        <w:t>Production CORS allows only configured frontend origins. The CSP uses local fonts or explicitly trusted sources. Secrets are held in platform environment settings, not committed files. Redis is recommended for multi-instance notification broadcast and shared operational state. Error reporting, encrypted-backup and verification scripts, health monitoring, and deployment workflows provide mechanisms for operational evidence. Their presence does not prove that a production backup has completed or been restored successfully. An overdue-observation monitor can be enabled by an administrator to control hosting cost rather than running permanently.</w:t>
       </w:r>
     </w:p>
     <w:p>
@@ -2764,7 +3155,7 @@
               <w:jc w:val="left"/>
             </w:pPr>
             <w:r>
-              <w:t>OAuth validation, external identity and deduplication</w:t>
+              <w:t>Known connection lookup, OAuth-backed retrieval from Withings and external-measurement deduplication</w:t>
             </w:r>
           </w:p>
         </w:tc>
@@ -3113,7 +3504,7 @@
       <w:r>
         <w:drawing>
           <wp:inline xmlns:a="http://schemas.openxmlformats.org/drawingml/2006/main" xmlns:pic="http://schemas.openxmlformats.org/drawingml/2006/picture">
-            <wp:extent cx="5166360" cy="3515995"/>
+            <wp:extent cx="5230368" cy="3559556"/>
             <wp:docPr id="6" name="Picture 6" descr="Screenshot of the doctor dashboard showing four assigned patients, three high-risk patients, the selected patient’s heart rate, oxygen saturation, blood pressure and risk score, with clinical note and escalation controls." title="Figure 5.1: Doctor dashboard displaying an assigned patient and current clinical observations."/>
             <wp:cNvGraphicFramePr>
               <a:graphicFrameLocks noChangeAspect="1"/>
@@ -3134,7 +3525,7 @@
                   <pic:spPr>
                     <a:xfrm>
                       <a:off x="0" y="0"/>
-                      <a:ext cx="5166360" cy="3515995"/>
+                      <a:ext cx="5230368" cy="3559556"/>
                     </a:xfrm>
                     <a:prstGeom prst="rect"/>
                   </pic:spPr>
@@ -3173,7 +3564,7 @@
       <w:r>
         <w:drawing>
           <wp:inline xmlns:a="http://schemas.openxmlformats.org/drawingml/2006/main" xmlns:pic="http://schemas.openxmlformats.org/drawingml/2006/picture">
-            <wp:extent cx="5166360" cy="3515995"/>
+            <wp:extent cx="5230368" cy="3559556"/>
             <wp:docPr id="7" name="Picture 7" descr="Screenshot of the nurse dashboard with medication, vital-observation, alert and task cards and navigation restricted to nursing workflows." title="Figure 5.2: Nurse dashboard organised around bedside care activities."/>
             <wp:cNvGraphicFramePr>
               <a:graphicFrameLocks noChangeAspect="1"/>
@@ -3194,7 +3585,7 @@
                   <pic:spPr>
                     <a:xfrm>
                       <a:off x="0" y="0"/>
-                      <a:ext cx="5166360" cy="3515995"/>
+                      <a:ext cx="5230368" cy="3559556"/>
                     </a:xfrm>
                     <a:prstGeom prst="rect"/>
                   </pic:spPr>
@@ -3233,7 +3624,7 @@
       <w:r>
         <w:drawing>
           <wp:inline xmlns:a="http://schemas.openxmlformats.org/drawingml/2006/main" xmlns:pic="http://schemas.openxmlformats.org/drawingml/2006/picture">
-            <wp:extent cx="5166360" cy="3515995"/>
+            <wp:extent cx="5230368" cy="3559556"/>
             <wp:docPr id="8" name="Picture 8" descr="Screenshot of the administrator dashboard showing user, assignment, approval, referral and audit-log functions without patient observations." title="Figure 5.3: Administrator dashboard for non-clinical platform governance."/>
             <wp:cNvGraphicFramePr>
               <a:graphicFrameLocks noChangeAspect="1"/>
@@ -3254,7 +3645,7 @@
                   <pic:spPr>
                     <a:xfrm>
                       <a:off x="0" y="0"/>
-                      <a:ext cx="5166360" cy="3515995"/>
+                      <a:ext cx="5230368" cy="3559556"/>
                     </a:xfrm>
                     <a:prstGeom prst="rect"/>
                   </pic:spPr>
@@ -3325,7 +3716,7 @@
       <w:r>
         <w:drawing>
           <wp:inline xmlns:a="http://schemas.openxmlformats.org/drawingml/2006/main" xmlns:pic="http://schemas.openxmlformats.org/drawingml/2006/picture">
-            <wp:extent cx="5166360" cy="3515995"/>
+            <wp:extent cx="5230368" cy="3559556"/>
             <wp:docPr id="9" name="Picture 9" descr="Screenshot of the notification centre showing inbox and read-history tabs, search and a clear empty state for the current doctor." title="Figure 5.4: Notification centre with unread inbox and retained read history."/>
             <wp:cNvGraphicFramePr>
               <a:graphicFrameLocks noChangeAspect="1"/>
@@ -3346,7 +3737,7 @@
                   <pic:spPr>
                     <a:xfrm>
                       <a:off x="0" y="0"/>
-                      <a:ext cx="5166360" cy="3515995"/>
+                      <a:ext cx="5230368" cy="3559556"/>
                     </a:xfrm>
                     <a:prstGeom prst="rect"/>
                   </pic:spPr>
@@ -3409,7 +3800,7 @@
       <w:r>
         <w:drawing>
           <wp:inline xmlns:a="http://schemas.openxmlformats.org/drawingml/2006/main" xmlns:pic="http://schemas.openxmlformats.org/drawingml/2006/picture">
-            <wp:extent cx="5166360" cy="2370935"/>
+            <wp:extent cx="5230368" cy="2400309"/>
             <wp:docPr id="10" name="Picture 10" descr="Flow from licensed cohort and patient-grouped splitting through temporal features, model selection, calibration, locked evaluation, versioned artifact and shadow monitoring." title="Figure 5.5: Reproducible machine-learning lifecycle."/>
             <wp:cNvGraphicFramePr>
               <a:graphicFrameLocks noChangeAspect="1"/>
@@ -3430,7 +3821,7 @@
                   <pic:spPr>
                     <a:xfrm>
                       <a:off x="0" y="0"/>
-                      <a:ext cx="5166360" cy="2370935"/>
+                      <a:ext cx="5230368" cy="2400309"/>
                     </a:xfrm>
                     <a:prstGeom prst="rect"/>
                   </pic:spPr>
@@ -3458,7 +3849,7 @@
         <w:widowControl/>
       </w:pPr>
       <w:r>
-        <w:t>The offline pipeline prepares a licensed longitudinal CSV, verifies required identifiers and timestamps, creates a genuine future-outcome label, separates patients and builds temporal features. Candidate models are fitted and compared, calibrated probabilities are evaluated, and a threshold is selected on validation data. The resulting model.joblib and evaluation.json must share a schema version before the API loads them. The evaluation artifact also stores dataset SHA-256, model version, reference profiles, fairness tables and limitations.</w:t>
+        <w:t>Figure 5.5 summarises the separation between development, locked evaluation and runtime governance. The offline pipeline prepares a licensed longitudinal CSV, verifies required identifiers and timestamps, creates a genuine future-outcome label, separates patients and builds temporal features. Candidate models are fitted and compared, calibrated probabilities are evaluated, and a threshold is selected on validation data. The resulting model.joblib and evaluation.json must share a schema version before the API loads them. The evaluation artifact also stores dataset SHA-256, model version, reference profiles, fairness tables and limitations.</w:t>
       </w:r>
     </w:p>
     <w:p>
@@ -3466,7 +3857,7 @@
         <w:widowControl/>
       </w:pPr>
       <w:r>
-        <w:t>At runtime, an accessible patient’s latest history is transformed using the same feature contract. Deterministic critical values return a safety-override source without claiming a model probability. Otherwise the versioned model produces the predicted probability of a critical event in the following six hours, the risk window, anomaly information, drift score and local SHAP evidence. The interface reports this value as “Predicted 6-hour critical-event probability” rather than converting it into confidence using the larger class probability. If the artifact is unavailable, the calculated fallback is identified explicitly and no fixed confidence value is shown. Governance selects disabled, shadow or live mode. Automatic suspension can occur after repeated observations exceed the configured drift boundary. Model rollback changes the active code-approved version rather than implying clinical or regulatory approval.</w:t>
+        <w:t>At runtime, an accessible patient’s latest history is transformed using the same feature contract. Deterministic critical values return a safety-override source without claiming a model probability. Otherwise the versioned model produces the predicted probability of a critical event in the following six hours, the risk window, anomaly information, drift score and local SHAP evidence. The interface reports this value as “Predicted 6-hour critical-event probability” rather than converting it into confidence using the larger class probability. If the artifact is unavailable, the calculated fallback is identified explicitly and no fixed confidence value is shown. Governance selects disabled, shadow or live mode. Automatic suspension can occur after repeated observations exceed the configured drift boundary. The governance setting records an active version and the runtime rejects a loaded artifact with a different version. However, the repository contains only one committed model artifact, so this is version enforcement rather than a demonstrated multi-artifact rollback facility.</w:t>
       </w:r>
     </w:p>
     <w:p>
@@ -3477,8 +3868,8 @@
       <w:r>
         <w:drawing>
           <wp:inline xmlns:a="http://schemas.openxmlformats.org/drawingml/2006/main" xmlns:pic="http://schemas.openxmlformats.org/drawingml/2006/picture">
-            <wp:extent cx="5166360" cy="5777925"/>
-            <wp:docPr id="11" name="Picture 11" descr="Screenshot of the Six-Hour ML Prediction panel showing the event probability, runtime source, model version and leading SHAP evidence. Synthetic demonstration input is identified when present." title="Figure 5.5a: Trained six-hour model output with explicit probability and provenance."/>
+            <wp:extent cx="5230368" cy="5849510"/>
+            <wp:docPr id="11" name="Picture 11" descr="Screenshot of the Six-Hour ML Prediction panel showing the event probability, runtime source, model version and leading SHAP evidence. Synthetic demonstration input is identified when present." title="Figure 5.6: Trained six-hour model output with explicit probability and provenance."/>
             <wp:cNvGraphicFramePr>
               <a:graphicFrameLocks noChangeAspect="1"/>
             </wp:cNvGraphicFramePr>
@@ -3498,7 +3889,7 @@
                   <pic:spPr>
                     <a:xfrm>
                       <a:off x="0" y="0"/>
-                      <a:ext cx="5166360" cy="5777925"/>
+                      <a:ext cx="5230368" cy="5849510"/>
                     </a:xfrm>
                     <a:prstGeom prst="rect"/>
                   </pic:spPr>
@@ -3518,7 +3909,7 @@
         <w:rPr>
           <w:i/>
         </w:rPr>
-        <w:t>Figure 5.5a: Trained six-hour model output with explicit probability and provenance. Source: author-generated from the implemented system and evaluation artifact.</w:t>
+        <w:t>Figure 5.6: Trained six-hour model output with explicit probability and provenance. Source: author-generated from the implemented system and evaluation artifact.</w:t>
       </w:r>
     </w:p>
     <w:p>
@@ -3526,7 +3917,7 @@
         <w:widowControl/>
       </w:pPr>
       <w:r>
-        <w:t>Figure 5.5a shows the corrected presentation contract. The 1.8% value is the model's predicted probability of the defined event within six hours; it is not presented as 98.2% confidence. The method line identifies the trained artifact and version, while the evidence list reports local SHAP contributions. This separation prevents the probability, deterministic safety rules and locally calculated health indicators from being treated as interchangeable forms of AI.</w:t>
+        <w:t>Figure 5.6 shows the corrected presentation contract. The 1.8% value is the model's predicted probability of the defined event within six hours; it is not presented as 98.2% confidence. The method line identifies the trained artifact and version, while the evidence list reports local SHAP contributions. This separation prevents the probability, deterministic safety rules and locally calculated health indicators from being treated as interchangeable forms of AI.</w:t>
       </w:r>
     </w:p>
     <w:p>
@@ -3545,8 +3936,8 @@
       <w:r>
         <w:drawing>
           <wp:inline xmlns:a="http://schemas.openxmlformats.org/drawingml/2006/main" xmlns:pic="http://schemas.openxmlformats.org/drawingml/2006/picture">
-            <wp:extent cx="5166360" cy="3515995"/>
-            <wp:docPr id="12" name="Picture 12" descr="Screenshot of the administrator-only research workspace showing model version, ROC-AUC, sensitivity, specificity, prospective confusion counts and pseudonymous SUS collection." title="Figure 5.6: Restricted research evidence workspace."/>
+            <wp:extent cx="5230368" cy="3559556"/>
+            <wp:docPr id="12" name="Picture 12" descr="Screenshot of the administrator-only research workspace showing model version, ROC-AUC, sensitivity, specificity, prospective confusion counts and pseudonymous SUS collection." title="Figure 5.7: Restricted research evidence workspace."/>
             <wp:cNvGraphicFramePr>
               <a:graphicFrameLocks noChangeAspect="1"/>
             </wp:cNvGraphicFramePr>
@@ -3566,7 +3957,7 @@
                   <pic:spPr>
                     <a:xfrm>
                       <a:off x="0" y="0"/>
-                      <a:ext cx="5166360" cy="3515995"/>
+                      <a:ext cx="5230368" cy="3559556"/>
                     </a:xfrm>
                     <a:prstGeom prst="rect"/>
                   </pic:spPr>
@@ -3586,7 +3977,7 @@
         <w:rPr>
           <w:i/>
         </w:rPr>
-        <w:t>Figure 5.6: Restricted research evidence workspace. Source: author-generated from the implemented system and evaluation artifact.</w:t>
+        <w:t>Figure 5.7: Restricted research evidence workspace. Source: author-generated from the implemented system and evaluation artifact.</w:t>
       </w:r>
     </w:p>
     <w:p>
@@ -3594,7 +3985,7 @@
         <w:widowControl/>
       </w:pPr>
       <w:r>
-        <w:t>Figure 5.6 makes the evidence boundary explicit. Retrospective model metrics are visible, while prospective outcomes, effectiveness records and usability sessions remain zero until real approved activities occur. This prevents an implemented form from being confused with completed research and provides a direct route for exporting later evidence.</w:t>
+        <w:t>Figure 5.7 makes the evidence boundary explicit. Retrospective model metrics are visible, while prospective outcomes, effectiveness records and usability sessions remain zero until real approved activities occur. This prevents an implemented form from being confused with completed research and provides a direct route for exporting later evidence.</w:t>
       </w:r>
     </w:p>
     <w:p>
@@ -3621,8 +4012,8 @@
       <w:r>
         <w:drawing>
           <wp:inline xmlns:a="http://schemas.openxmlformats.org/drawingml/2006/main" xmlns:pic="http://schemas.openxmlformats.org/drawingml/2006/picture">
-            <wp:extent cx="5166360" cy="3515995"/>
-            <wp:docPr id="13" name="Picture 13" descr="Screenshot of the clinician Groq AI Assistant showing the assigned-patient selector, non-diagnostic warning, generation metadata, stale-data status, evidence-support indicator, structured summary and timestamped evidence." title="Figure 5.7: Evidence-linked clinician Groq AI Assistant."/>
+            <wp:extent cx="5230368" cy="3559556"/>
+            <wp:docPr id="13" name="Picture 13" descr="Screenshot of the clinician Groq AI Assistant showing the assigned-patient selector, non-diagnostic warning, generation metadata, stale-data status, evidence-support indicator, structured summary and timestamped evidence." title="Figure 5.8: Evidence-linked clinician Groq AI Assistant."/>
             <wp:cNvGraphicFramePr>
               <a:graphicFrameLocks noChangeAspect="1"/>
             </wp:cNvGraphicFramePr>
@@ -3642,7 +4033,7 @@
                   <pic:spPr>
                     <a:xfrm>
                       <a:off x="0" y="0"/>
-                      <a:ext cx="5166360" cy="3515995"/>
+                      <a:ext cx="5230368" cy="3559556"/>
                     </a:xfrm>
                     <a:prstGeom prst="rect"/>
                   </pic:spPr>
@@ -3662,7 +4053,7 @@
         <w:rPr>
           <w:i/>
         </w:rPr>
-        <w:t>Figure 5.7: Evidence-linked clinician Groq AI Assistant. Source: author-generated from the implemented system and evaluation artifact.</w:t>
+        <w:t>Figure 5.8: Evidence-linked clinician Groq AI Assistant. Source: author-generated from the implemented system and evaluation artifact.</w:t>
       </w:r>
     </w:p>
     <w:p>
@@ -3670,7 +4061,7 @@
         <w:widowControl/>
       </w:pPr>
       <w:r>
-        <w:t>The interface in Figure 5.7 operationalises the assistant safety contract. The top warning states that the content is not a diagnosis, while generation time, provider-model identifier, stale-data badge and provider availability describe context. Risk and evidence support are separated from the narrative, and supporting evidence is presented as a timestamped record rather than an untraceable claim.</w:t>
+        <w:t>The interface in Figure 5.8 operationalises the assistant safety contract. The top warning states that the content is not a diagnosis, while generation time, provider-model identifier, stale-data badge and provider availability describe context. Risk and evidence support are separated from the narrative, and supporting evidence is presented as a timestamped record rather than an untraceable claim.</w:t>
       </w:r>
     </w:p>
     <w:p>
@@ -3713,8 +4104,8 @@
       <w:r>
         <w:drawing>
           <wp:inline xmlns:a="http://schemas.openxmlformats.org/drawingml/2006/main" xmlns:pic="http://schemas.openxmlformats.org/drawingml/2006/picture">
-            <wp:extent cx="5166360" cy="3515995"/>
-            <wp:docPr id="14" name="Picture 14" descr="Screenshot of the public login interface showing clinical branding, labelled email and password fields, optional authenticator code, access-request route and security messaging." title="Figure 5.8: Responsive authentication interface."/>
+            <wp:extent cx="5230368" cy="3559556"/>
+            <wp:docPr id="14" name="Picture 14" descr="Screenshot of the public login interface showing clinical branding, labelled email and password fields, optional authenticator code, access-request route and security messaging." title="Figure 5.9: Responsive authentication interface."/>
             <wp:cNvGraphicFramePr>
               <a:graphicFrameLocks noChangeAspect="1"/>
             </wp:cNvGraphicFramePr>
@@ -3734,7 +4125,7 @@
                   <pic:spPr>
                     <a:xfrm>
                       <a:off x="0" y="0"/>
-                      <a:ext cx="5166360" cy="3515995"/>
+                      <a:ext cx="5230368" cy="3559556"/>
                     </a:xfrm>
                     <a:prstGeom prst="rect"/>
                   </pic:spPr>
@@ -3754,7 +4145,7 @@
         <w:rPr>
           <w:i/>
         </w:rPr>
-        <w:t>Figure 5.8: Responsive authentication interface. Source: author-generated from the implemented system and evaluation artifact.</w:t>
+        <w:t>Figure 5.9: Responsive authentication interface. Source: author-generated from the implemented system and evaluation artifact.</w:t>
       </w:r>
     </w:p>
     <w:p>
@@ -3762,7 +4153,7 @@
         <w:widowControl/>
       </w:pPr>
       <w:r>
-        <w:t>Figure 5.8 illustrates the public authentication boundary. The page provides labelled credentials, an optional one-time authenticator field and a separate access-request route. It does not publish demonstration passwords. Security and AI-assistance statements are presented as concise context rather than as substitutes for the underlying authentication controls.</w:t>
+        <w:t>Figure 5.9 illustrates the public authentication boundary. The page provides labelled credentials, an optional one-time authenticator field and a separate access-request route. It does not publish demonstration passwords. Security and AI-assistance statements are presented as concise context rather than as substitutes for the underlying authentication controls.</w:t>
       </w:r>
     </w:p>
     <w:p>
@@ -3898,7 +4289,7 @@
         <w:widowControl/>
       </w:pPr>
       <w:r>
-        <w:t>The frontend passed TypeScript production build and ESLint. Fifteen Playwright checks passed and one deployment-only scenario was intentionally skipped when external credentials were unavailable. Browser tests covered login and registration, password visibility, invalid login feedback, responsive layouts, accessibility, skip navigation, reduced motion and 200% zoom. Axe reported no critical or serious detectable issues on the tested public pages. The dependency audit reported no known high-severity vulnerability at the time of verification.</w:t>
+        <w:t>The final audit on 19 August 2026 confirmed that the TypeScript production build and ESLint passed. The backend suite also passed all 50 tests. The current Playwright rerun was not clean: 3 tests passed, 12 failed and 1 deployment-dependent test was skipped. Most failures involved Vite development-server navigation or dynamically imported modules timing out under the four-worker run, followed by downstream element-not-found failures. Earlier project evidence had recorded 15 passing browser checks and one conditional skip, but that historical result is not presented as the current state. The failed rerun means that login, registration, role navigation, patient switching, notification history and automated accessibility scenarios require diagnosis and a clean repeated run before submission. Because both Axe page tests timed out in the latest run, the previous zero critical/serious finding could not be reproduced during this audit.</w:t>
       </w:r>
     </w:p>
     <w:tbl>
@@ -4129,7 +4520,7 @@
               <w:jc w:val="left"/>
             </w:pPr>
             <w:r>
-              <w:t>Playwright</w:t>
+              <w:t>Playwright final rerun</w:t>
             </w:r>
           </w:p>
         </w:tc>
@@ -4144,7 +4535,7 @@
               <w:jc w:val="left"/>
             </w:pPr>
             <w:r>
-              <w:t>15 passed; 1 conditional skip</w:t>
+              <w:t>3 passed; 12 failed; 1 skipped</w:t>
             </w:r>
           </w:p>
         </w:tc>
@@ -4159,7 +4550,7 @@
               <w:jc w:val="left"/>
             </w:pPr>
             <w:r>
-              <w:t>Core browser and accessibility scenarios passed</w:t>
+              <w:t>Current suite is not clean; most failures followed development-server navigation or dynamic-import timeouts</w:t>
             </w:r>
           </w:p>
         </w:tc>
@@ -4176,7 +4567,7 @@
               <w:jc w:val="left"/>
             </w:pPr>
             <w:r>
-              <w:t>Axe critical/serious</w:t>
+              <w:t>Axe final rerun</w:t>
             </w:r>
           </w:p>
         </w:tc>
@@ -4191,7 +4582,7 @@
               <w:jc w:val="left"/>
             </w:pPr>
             <w:r>
-              <w:t>0 on tested pages</w:t>
+              <w:t>Not completed</w:t>
             </w:r>
           </w:p>
         </w:tc>
@@ -4206,7 +4597,7 @@
               <w:jc w:val="left"/>
             </w:pPr>
             <w:r>
-              <w:t>No automatically detectable issue at these severities</w:t>
+              <w:t>Both public-page Axe checks timed out, so the earlier zero-finding result was not reproduced</w:t>
             </w:r>
           </w:p>
         </w:tc>
@@ -4651,14 +5042,74 @@
     </w:p>
     <w:p>
       <w:pPr>
+        <w:widowControl/>
+      </w:pPr>
+      <w:r>
+        <w:t>Figure 6.1 compares the two candidate pipelines at the default 0.5 decision threshold used during model selection. Logistic regression achieved the higher validation ROC-AUC (0.810 versus 0.791), so the selection follows the documented code rule. The random forest's higher validation PR-AUC and precision show that model choice is not uniformly superior across every measure. This trade-off should be reported rather than reduced to a claim that one algorithm was simply "best".</w:t>
+      </w:r>
+    </w:p>
+    <w:p>
+      <w:pPr>
         <w:keepNext/>
         <w:jc w:val="center"/>
       </w:pPr>
       <w:r>
         <w:drawing>
           <wp:inline xmlns:a="http://schemas.openxmlformats.org/drawingml/2006/main" xmlns:pic="http://schemas.openxmlformats.org/drawingml/2006/picture">
-            <wp:extent cx="5166360" cy="4067222"/>
-            <wp:docPr id="15" name="Picture 15" descr="Confusion matrix with 4,121 true negatives, 1,403 false positives, 21 false negatives and 55 true positives." title="Figure 6.1: Internal test confusion matrix at the 0.014 threshold."/>
+            <wp:extent cx="5230368" cy="3549178"/>
+            <wp:docPr id="15" name="Picture 15" descr="Grouped bar chart comparing logistic regression and random forest validation ROC-AUC, PR-AUC and F1 at the default 0.5 threshold." title="Figure 6.1: Candidate-model performance on the validation partition."/>
+            <wp:cNvGraphicFramePr>
+              <a:graphicFrameLocks noChangeAspect="1"/>
+            </wp:cNvGraphicFramePr>
+            <a:graphic>
+              <a:graphicData uri="http://schemas.openxmlformats.org/drawingml/2006/picture">
+                <pic:pic>
+                  <pic:nvPicPr>
+                    <pic:cNvPr id="0" name="candidate_model_comparison.png"/>
+                    <pic:cNvPicPr/>
+                  </pic:nvPicPr>
+                  <pic:blipFill>
+                    <a:blip r:embed="rId26"/>
+                    <a:stretch>
+                      <a:fillRect/>
+                    </a:stretch>
+                  </pic:blipFill>
+                  <pic:spPr>
+                    <a:xfrm>
+                      <a:off x="0" y="0"/>
+                      <a:ext cx="5230368" cy="3549178"/>
+                    </a:xfrm>
+                    <a:prstGeom prst="rect"/>
+                  </pic:spPr>
+                </pic:pic>
+              </a:graphicData>
+            </a:graphic>
+          </wp:inline>
+        </w:drawing>
+      </w:r>
+    </w:p>
+    <w:p>
+      <w:pPr>
+        <w:pStyle w:val="Caption"/>
+        <w:jc w:val="center"/>
+      </w:pPr>
+      <w:r>
+        <w:rPr>
+          <w:i/>
+        </w:rPr>
+        <w:t>Figure 6.1: Candidate-model performance on the validation partition. Source: author-generated from the implemented system and evaluation artifact.</w:t>
+      </w:r>
+    </w:p>
+    <w:p>
+      <w:pPr>
+        <w:keepNext/>
+        <w:jc w:val="center"/>
+      </w:pPr>
+      <w:r>
+        <w:drawing>
+          <wp:inline xmlns:a="http://schemas.openxmlformats.org/drawingml/2006/main" xmlns:pic="http://schemas.openxmlformats.org/drawingml/2006/picture">
+            <wp:extent cx="5230368" cy="4117612"/>
+            <wp:docPr id="16" name="Picture 16" descr="Confusion matrix with 4,121 true negatives, 1,403 false positives, 21 false negatives and 55 true positives." title="Figure 6.2: Internal test confusion matrix at the 0.014 threshold."/>
             <wp:cNvGraphicFramePr>
               <a:graphicFrameLocks noChangeAspect="1"/>
             </wp:cNvGraphicFramePr>
@@ -4670,7 +5121,7 @@
                     <pic:cNvPicPr/>
                   </pic:nvPicPr>
                   <pic:blipFill>
-                    <a:blip r:embed="rId26"/>
+                    <a:blip r:embed="rId27"/>
                     <a:stretch>
                       <a:fillRect/>
                     </a:stretch>
@@ -4678,7 +5129,7 @@
                   <pic:spPr>
                     <a:xfrm>
                       <a:off x="0" y="0"/>
-                      <a:ext cx="5166360" cy="4067222"/>
+                      <a:ext cx="5230368" cy="4117612"/>
                     </a:xfrm>
                     <a:prstGeom prst="rect"/>
                   </pic:spPr>
@@ -4698,7 +5149,7 @@
         <w:rPr>
           <w:i/>
         </w:rPr>
-        <w:t>Figure 6.1: Internal test confusion matrix at the 0.014 threshold. Source: author-generated from the implemented system and evaluation artifact.</w:t>
+        <w:t>Figure 6.2: Internal test confusion matrix at the 0.014 threshold. Source: author-generated from the implemented system and evaluation artifact.</w:t>
       </w:r>
     </w:p>
     <w:p>
@@ -4706,7 +5157,7 @@
         <w:widowControl/>
       </w:pPr>
       <w:r>
-        <w:t>The test confusion matrix contained 4,121 true negatives, 1,403 false positives, 21 false negatives and 55 true positives. The ROC-AUC of 0.833 indicates useful ranking discrimination within the retrospective test data. PR-AUC of 0.166 is more informative for the uncommon positive outcome. Sensitivity of 0.724 reflects the deliberately low threshold, but precision of 0.038 means that only a small proportion of positive prompts corresponded to the defined future event. This creates a clinically important burden.</w:t>
+        <w:t>Figure 6.2 makes the operating consequences of the threshold visible: the test confusion matrix contained 4,121 true negatives, 1,403 false positives, 21 false negatives and 55 true positives. The ROC-AUC of 0.833 indicates useful ranking discrimination within the retrospective test data. PR-AUC of 0.166 is more informative for the uncommon positive outcome. Sensitivity of 0.724 reflects the deliberately low threshold, but precision of 0.038 means that only a small proportion of positive prompts corresponded to the defined future event. This creates a clinically important burden.</w:t>
       </w:r>
     </w:p>
     <w:p>
@@ -4717,8 +5168,8 @@
       <w:r>
         <w:drawing>
           <wp:inline xmlns:a="http://schemas.openxmlformats.org/drawingml/2006/main" xmlns:pic="http://schemas.openxmlformats.org/drawingml/2006/picture">
-            <wp:extent cx="5166360" cy="4073165"/>
-            <wp:docPr id="16" name="Picture 16" descr="Line chart comparing observed critical-event frequency with mean predicted probability across ten probability groups and the ideal calibration line." title="Figure 6.2: Internal test calibration plot."/>
+            <wp:extent cx="5230368" cy="4123629"/>
+            <wp:docPr id="17" name="Picture 17" descr="Line chart comparing observed critical-event frequency with mean predicted probability across ten probability groups and the ideal calibration line." title="Figure 6.3: Internal test calibration plot."/>
             <wp:cNvGraphicFramePr>
               <a:graphicFrameLocks noChangeAspect="1"/>
             </wp:cNvGraphicFramePr>
@@ -4730,7 +5181,7 @@
                     <pic:cNvPicPr/>
                   </pic:nvPicPr>
                   <pic:blipFill>
-                    <a:blip r:embed="rId27"/>
+                    <a:blip r:embed="rId28"/>
                     <a:stretch>
                       <a:fillRect/>
                     </a:stretch>
@@ -4738,7 +5189,7 @@
                   <pic:spPr>
                     <a:xfrm>
                       <a:off x="0" y="0"/>
-                      <a:ext cx="5166360" cy="4073165"/>
+                      <a:ext cx="5230368" cy="4123629"/>
                     </a:xfrm>
                     <a:prstGeom prst="rect"/>
                   </pic:spPr>
@@ -4758,7 +5209,7 @@
         <w:rPr>
           <w:i/>
         </w:rPr>
-        <w:t>Figure 6.2: Internal test calibration plot. Source: author-generated from the implemented system and evaluation artifact.</w:t>
+        <w:t>Figure 6.3: Internal test calibration plot. Source: author-generated from the implemented system and evaluation artifact.</w:t>
       </w:r>
     </w:p>
     <w:p>
@@ -4766,7 +5217,15 @@
         <w:widowControl/>
       </w:pPr>
       <w:r>
-        <w:t>External Set B produced 19,934 true negatives, 7,551 false positives, 142 false negatives and 373 true positives. ROC-AUC fell to 0.785 and PR-AUC to 0.106. Brier score remained low partly because the event is rare; calibration plots must therefore be examined alongside aggregate score. Gender and age-group subgroup estimates were exported, but small positive counts make some gaps unstable. The results do not prove fairness.</w:t>
+        <w:t>Figure 6.3 shows that calibration is not uniform across the grouped probability range. External Set B produced 19,934 true negatives, 7,551 false positives, 142 false negatives and 373 true positives. ROC-AUC fell to 0.785 and PR-AUC to 0.106. Brier score remained low partly because the event is rare; calibration plots must therefore be examined alongside aggregate score. Gender and age-group subgroup estimates were exported, but small positive counts make some gaps unstable. The results do not prove fairness.</w:t>
+      </w:r>
+    </w:p>
+    <w:p>
+      <w:pPr>
+        <w:widowControl/>
+      </w:pPr>
+      <w:r>
+        <w:t>Figure 6.4 shows that sensitivity remained similar between the internal test and Set B, while discrimination and precision decreased. This is related-cohort retrospective evidence because both sets originate from the same ICU challenge context. It neither demonstrates smartwatch generalisation nor establishes that the selected threshold would create an acceptable workload in practice.</w:t>
       </w:r>
     </w:p>
     <w:p>
@@ -4777,8 +5236,60 @@
       <w:r>
         <w:drawing>
           <wp:inline xmlns:a="http://schemas.openxmlformats.org/drawingml/2006/main" xmlns:pic="http://schemas.openxmlformats.org/drawingml/2006/picture">
-            <wp:extent cx="5166360" cy="3761224"/>
-            <wp:docPr id="17" name="Picture 17" descr="Horizontal bar chart of mean absolute SHAP values, led by three-reading systolic blood-pressure mean and heart rate." title="Figure 6.3: Global SHAP feature influence in the evaluation sample."/>
+            <wp:extent cx="5230368" cy="3158682"/>
+            <wp:docPr id="18" name="Picture 18" descr="Grouped bar chart comparing ROC-AUC, PR-AUC, sensitivity, specificity and precision for the internal test and related external Set B cohort." title="Figure 6.4: Internal test and external Set B metric comparison."/>
+            <wp:cNvGraphicFramePr>
+              <a:graphicFrameLocks noChangeAspect="1"/>
+            </wp:cNvGraphicFramePr>
+            <a:graphic>
+              <a:graphicData uri="http://schemas.openxmlformats.org/drawingml/2006/picture">
+                <pic:pic>
+                  <pic:nvPicPr>
+                    <pic:cNvPr id="0" name="cohort_metric_comparison.png"/>
+                    <pic:cNvPicPr/>
+                  </pic:nvPicPr>
+                  <pic:blipFill>
+                    <a:blip r:embed="rId29"/>
+                    <a:stretch>
+                      <a:fillRect/>
+                    </a:stretch>
+                  </pic:blipFill>
+                  <pic:spPr>
+                    <a:xfrm>
+                      <a:off x="0" y="0"/>
+                      <a:ext cx="5230368" cy="3158682"/>
+                    </a:xfrm>
+                    <a:prstGeom prst="rect"/>
+                  </pic:spPr>
+                </pic:pic>
+              </a:graphicData>
+            </a:graphic>
+          </wp:inline>
+        </w:drawing>
+      </w:r>
+    </w:p>
+    <w:p>
+      <w:pPr>
+        <w:pStyle w:val="Caption"/>
+        <w:jc w:val="center"/>
+      </w:pPr>
+      <w:r>
+        <w:rPr>
+          <w:i/>
+        </w:rPr>
+        <w:t>Figure 6.4: Internal test and external Set B metric comparison. Source: author-generated from the implemented system and evaluation artifact.</w:t>
+      </w:r>
+    </w:p>
+    <w:p>
+      <w:pPr>
+        <w:keepNext/>
+        <w:jc w:val="center"/>
+      </w:pPr>
+      <w:r>
+        <w:drawing>
+          <wp:inline xmlns:a="http://schemas.openxmlformats.org/drawingml/2006/main" xmlns:pic="http://schemas.openxmlformats.org/drawingml/2006/picture">
+            <wp:extent cx="5230368" cy="3807823"/>
+            <wp:docPr id="19" name="Picture 19" descr="Horizontal bar chart of mean absolute SHAP values, led by three-reading systolic blood-pressure mean and heart rate." title="Figure 6.5: Global SHAP feature influence in the evaluation sample."/>
             <wp:cNvGraphicFramePr>
               <a:graphicFrameLocks noChangeAspect="1"/>
             </wp:cNvGraphicFramePr>
@@ -4790,7 +5301,7 @@
                     <pic:cNvPicPr/>
                   </pic:nvPicPr>
                   <pic:blipFill>
-                    <a:blip r:embed="rId28"/>
+                    <a:blip r:embed="rId30"/>
                     <a:stretch>
                       <a:fillRect/>
                     </a:stretch>
@@ -4798,7 +5309,7 @@
                   <pic:spPr>
                     <a:xfrm>
                       <a:off x="0" y="0"/>
-                      <a:ext cx="5166360" cy="3761224"/>
+                      <a:ext cx="5230368" cy="3807823"/>
                     </a:xfrm>
                     <a:prstGeom prst="rect"/>
                   </pic:spPr>
@@ -4818,7 +5329,15 @@
         <w:rPr>
           <w:i/>
         </w:rPr>
-        <w:t>Figure 6.3: Global SHAP feature influence in the evaluation sample. Source: author-generated from the implemented system and evaluation artifact.</w:t>
+        <w:t>Figure 6.5: Global SHAP feature influence in the evaluation sample. Source: author-generated from the implemented system and evaluation artifact.</w:t>
+      </w:r>
+    </w:p>
+    <w:p>
+      <w:pPr>
+        <w:widowControl/>
+      </w:pPr>
+      <w:r>
+        <w:t>Figure 6.5 indicates which engineered features most influenced the fitted model across the evaluation sample. Mean absolute SHAP magnitude measures influence on model output, not clinical importance or causality. The figure is therefore useful for auditing model behaviour, but it cannot explain whether an association is clinically valid or transportable to another population.</w:t>
       </w:r>
     </w:p>
     <w:p>
@@ -4853,6 +5372,376 @@
         <w:t>Automated accessibility tools cannot evaluate the quality of screen-reader interaction, clinical comprehension or cognitive workload. No completed human SUS study is claimed. The model has not been prospectively tested, and its population differs from intended outpatient and wearable users. Redis outage, managed PostgreSQL restart and backup restoration have documented procedures but require repeated staging exercises under realistic load. The browser suite does not yet represent every cross-role workflow with a live seeded production-equivalent database.</w:t>
       </w:r>
     </w:p>
+    <w:tbl>
+      <w:tblPr>
+        <w:tblStyle w:val="TableGrid"/>
+        <w:tblW w:type="dxa" w:w="8310"/>
+        <w:jc w:val="center"/>
+        <w:tblLayout w:type="fixed"/>
+        <w:tblLook w:firstColumn="1" w:firstRow="1" w:lastColumn="0" w:lastRow="0" w:noHBand="0" w:noVBand="1" w:val="04A0"/>
+      </w:tblPr>
+      <w:tblGrid>
+        <w:gridCol w:w="2770"/>
+        <w:gridCol w:w="2770"/>
+        <w:gridCol w:w="2770"/>
+      </w:tblGrid>
+      <w:tr>
+        <w:trPr>
+          <w:tblHeader w:val="true"/>
+        </w:trPr>
+        <w:tc>
+          <w:tcPr>
+            <w:tcW w:type="dxa" w:w="2770"/>
+            <w:shd w:fill="E7E6E6"/>
+            <w:vAlign w:val="center"/>
+          </w:tcPr>
+          <w:p>
+            <w:pPr>
+              <w:ind w:firstLine="0"/>
+              <w:jc w:val="center"/>
+            </w:pPr>
+            <w:r>
+              <w:rPr>
+                <w:b/>
+              </w:rPr>
+              <w:t>Evidence area</w:t>
+            </w:r>
+          </w:p>
+        </w:tc>
+        <w:tc>
+          <w:tcPr>
+            <w:tcW w:type="dxa" w:w="2770"/>
+            <w:shd w:fill="E7E6E6"/>
+            <w:vAlign w:val="center"/>
+          </w:tcPr>
+          <w:p>
+            <w:pPr>
+              <w:ind w:firstLine="0"/>
+              <w:jc w:val="center"/>
+            </w:pPr>
+            <w:r>
+              <w:rPr>
+                <w:b/>
+              </w:rPr>
+              <w:t>Current status</w:t>
+            </w:r>
+          </w:p>
+        </w:tc>
+        <w:tc>
+          <w:tcPr>
+            <w:tcW w:type="dxa" w:w="2770"/>
+            <w:shd w:fill="E7E6E6"/>
+            <w:vAlign w:val="center"/>
+          </w:tcPr>
+          <w:p>
+            <w:pPr>
+              <w:ind w:firstLine="0"/>
+              <w:jc w:val="center"/>
+            </w:pPr>
+            <w:r>
+              <w:rPr>
+                <w:b/>
+              </w:rPr>
+              <w:t>Conclusion permitted</w:t>
+            </w:r>
+          </w:p>
+        </w:tc>
+      </w:tr>
+      <w:tr>
+        <w:tc>
+          <w:tcPr>
+            <w:tcW w:type="dxa" w:w="2770"/>
+            <w:vAlign w:val="center"/>
+          </w:tcPr>
+          <w:p>
+            <w:pPr>
+              <w:ind w:firstLine="0"/>
+              <w:jc w:val="left"/>
+            </w:pPr>
+            <w:r>
+              <w:t>Software implementation</w:t>
+            </w:r>
+          </w:p>
+        </w:tc>
+        <w:tc>
+          <w:tcPr>
+            <w:tcW w:type="dxa" w:w="2770"/>
+            <w:vAlign w:val="center"/>
+          </w:tcPr>
+          <w:p>
+            <w:pPr>
+              <w:ind w:firstLine="0"/>
+              <w:jc w:val="left"/>
+            </w:pPr>
+            <w:r>
+              <w:t>Implemented and covered by automated tests</w:t>
+            </w:r>
+          </w:p>
+        </w:tc>
+        <w:tc>
+          <w:tcPr>
+            <w:tcW w:type="dxa" w:w="2770"/>
+            <w:vAlign w:val="center"/>
+          </w:tcPr>
+          <w:p>
+            <w:pPr>
+              <w:ind w:firstLine="0"/>
+              <w:jc w:val="left"/>
+            </w:pPr>
+            <w:r>
+              <w:t>The tested workflows behave as specified in the repository environment</w:t>
+            </w:r>
+          </w:p>
+        </w:tc>
+      </w:tr>
+      <w:tr>
+        <w:tc>
+          <w:tcPr>
+            <w:tcW w:type="dxa" w:w="2770"/>
+            <w:vAlign w:val="center"/>
+          </w:tcPr>
+          <w:p>
+            <w:pPr>
+              <w:ind w:firstLine="0"/>
+              <w:jc w:val="left"/>
+            </w:pPr>
+            <w:r>
+              <w:t>Model discrimination</w:t>
+            </w:r>
+          </w:p>
+        </w:tc>
+        <w:tc>
+          <w:tcPr>
+            <w:tcW w:type="dxa" w:w="2770"/>
+            <w:vAlign w:val="center"/>
+          </w:tcPr>
+          <w:p>
+            <w:pPr>
+              <w:ind w:firstLine="0"/>
+              <w:jc w:val="left"/>
+            </w:pPr>
+            <w:r>
+              <w:t>Retrospectively evaluated on internal test and Set B</w:t>
+            </w:r>
+          </w:p>
+        </w:tc>
+        <w:tc>
+          <w:tcPr>
+            <w:tcW w:type="dxa" w:w="2770"/>
+            <w:vAlign w:val="center"/>
+          </w:tcPr>
+          <w:p>
+            <w:pPr>
+              <w:ind w:firstLine="0"/>
+              <w:jc w:val="left"/>
+            </w:pPr>
+            <w:r>
+              <w:t>Performance applies to the defined ICU-derived outcome and cohorts</w:t>
+            </w:r>
+          </w:p>
+        </w:tc>
+      </w:tr>
+      <w:tr>
+        <w:tc>
+          <w:tcPr>
+            <w:tcW w:type="dxa" w:w="2770"/>
+            <w:vAlign w:val="center"/>
+          </w:tcPr>
+          <w:p>
+            <w:pPr>
+              <w:ind w:firstLine="0"/>
+              <w:jc w:val="left"/>
+            </w:pPr>
+            <w:r>
+              <w:t>Human usability</w:t>
+            </w:r>
+          </w:p>
+        </w:tc>
+        <w:tc>
+          <w:tcPr>
+            <w:tcW w:type="dxa" w:w="2770"/>
+            <w:vAlign w:val="center"/>
+          </w:tcPr>
+          <w:p>
+            <w:pPr>
+              <w:ind w:firstLine="0"/>
+              <w:jc w:val="left"/>
+            </w:pPr>
+            <w:r>
+              <w:t>Protocol and collection infrastructure only</w:t>
+            </w:r>
+          </w:p>
+        </w:tc>
+        <w:tc>
+          <w:tcPr>
+            <w:tcW w:type="dxa" w:w="2770"/>
+            <w:vAlign w:val="center"/>
+          </w:tcPr>
+          <w:p>
+            <w:pPr>
+              <w:ind w:firstLine="0"/>
+              <w:jc w:val="left"/>
+            </w:pPr>
+            <w:r>
+              <w:t>No participant usability result is claimed</w:t>
+            </w:r>
+          </w:p>
+        </w:tc>
+      </w:tr>
+      <w:tr>
+        <w:tc>
+          <w:tcPr>
+            <w:tcW w:type="dxa" w:w="2770"/>
+            <w:vAlign w:val="center"/>
+          </w:tcPr>
+          <w:p>
+            <w:pPr>
+              <w:ind w:firstLine="0"/>
+              <w:jc w:val="left"/>
+            </w:pPr>
+            <w:r>
+              <w:t>Prospective clinical validation</w:t>
+            </w:r>
+          </w:p>
+        </w:tc>
+        <w:tc>
+          <w:tcPr>
+            <w:tcW w:type="dxa" w:w="2770"/>
+            <w:vAlign w:val="center"/>
+          </w:tcPr>
+          <w:p>
+            <w:pPr>
+              <w:ind w:firstLine="0"/>
+              <w:jc w:val="left"/>
+            </w:pPr>
+            <w:r>
+              <w:t>Infrastructure only</w:t>
+            </w:r>
+          </w:p>
+        </w:tc>
+        <w:tc>
+          <w:tcPr>
+            <w:tcW w:type="dxa" w:w="2770"/>
+            <w:vAlign w:val="center"/>
+          </w:tcPr>
+          <w:p>
+            <w:pPr>
+              <w:ind w:firstLine="0"/>
+              <w:jc w:val="left"/>
+            </w:pPr>
+            <w:r>
+              <w:t>No prospective performance or patient outcome is claimed</w:t>
+            </w:r>
+          </w:p>
+        </w:tc>
+      </w:tr>
+      <w:tr>
+        <w:tc>
+          <w:tcPr>
+            <w:tcW w:type="dxa" w:w="2770"/>
+            <w:vAlign w:val="center"/>
+          </w:tcPr>
+          <w:p>
+            <w:pPr>
+              <w:ind w:firstLine="0"/>
+              <w:jc w:val="left"/>
+            </w:pPr>
+            <w:r>
+              <w:t>Clinical effectiveness</w:t>
+            </w:r>
+          </w:p>
+        </w:tc>
+        <w:tc>
+          <w:tcPr>
+            <w:tcW w:type="dxa" w:w="2770"/>
+            <w:vAlign w:val="center"/>
+          </w:tcPr>
+          <w:p>
+            <w:pPr>
+              <w:ind w:firstLine="0"/>
+              <w:jc w:val="left"/>
+            </w:pPr>
+            <w:r>
+              <w:t>Not evaluated</w:t>
+            </w:r>
+          </w:p>
+        </w:tc>
+        <w:tc>
+          <w:tcPr>
+            <w:tcW w:type="dxa" w:w="2770"/>
+            <w:vAlign w:val="center"/>
+          </w:tcPr>
+          <w:p>
+            <w:pPr>
+              <w:ind w:firstLine="0"/>
+              <w:jc w:val="left"/>
+            </w:pPr>
+            <w:r>
+              <w:t>No claim that the system improves care or outcomes</w:t>
+            </w:r>
+          </w:p>
+        </w:tc>
+      </w:tr>
+      <w:tr>
+        <w:tc>
+          <w:tcPr>
+            <w:tcW w:type="dxa" w:w="2770"/>
+            <w:vAlign w:val="center"/>
+          </w:tcPr>
+          <w:p>
+            <w:pPr>
+              <w:ind w:firstLine="0"/>
+              <w:jc w:val="left"/>
+            </w:pPr>
+            <w:r>
+              <w:t>Regulatory status</w:t>
+            </w:r>
+          </w:p>
+        </w:tc>
+        <w:tc>
+          <w:tcPr>
+            <w:tcW w:type="dxa" w:w="2770"/>
+            <w:vAlign w:val="center"/>
+          </w:tcPr>
+          <w:p>
+            <w:pPr>
+              <w:ind w:firstLine="0"/>
+              <w:jc w:val="left"/>
+            </w:pPr>
+            <w:r>
+              <w:t>Preparation documents only</w:t>
+            </w:r>
+          </w:p>
+        </w:tc>
+        <w:tc>
+          <w:tcPr>
+            <w:tcW w:type="dxa" w:w="2770"/>
+            <w:vAlign w:val="center"/>
+          </w:tcPr>
+          <w:p>
+            <w:pPr>
+              <w:ind w:firstLine="0"/>
+              <w:jc w:val="left"/>
+            </w:pPr>
+            <w:r>
+              <w:t>No approval, conformity assessment or medical-device status is claimed</w:t>
+            </w:r>
+          </w:p>
+        </w:tc>
+      </w:tr>
+    </w:tbl>
+    <w:p>
+      <w:pPr>
+        <w:pStyle w:val="Caption"/>
+        <w:jc w:val="center"/>
+      </w:pPr>
+      <w:r>
+        <w:rPr>
+          <w:i/>
+        </w:rPr>
+        <w:t>Table 6.3: Evidence maturity and permitted conclusions.</w:t>
+      </w:r>
+    </w:p>
     <w:p>
       <w:pPr>
         <w:pStyle w:val="Heading2"/>
@@ -4890,7 +5779,7 @@
         <w:widowControl/>
       </w:pPr>
       <w:r>
-        <w:t>This chapter interprets the combined engineering and model evidence in relation to the research questions.</w:t>
+        <w:t>Chapter Six reported the observed software and model results. This chapter addresses a different question: what those results mean for the research problem. It explains why the system behaved as observed, relates the findings to the literature, and identifies the conclusions that the evidence does and does not support.</w:t>
       </w:r>
     </w:p>
     <w:p>
@@ -4898,7 +5787,7 @@
         <w:pStyle w:val="Heading2"/>
       </w:pPr>
       <w:r>
-        <w:t>7.2 Achievement of System Objectives</w:t>
+        <w:t>7.2 Research Question One: Building a Secure Monitoring Platform</w:t>
       </w:r>
     </w:p>
     <w:p>
@@ -4906,7 +5795,7 @@
         <w:widowControl/>
       </w:pPr>
       <w:r>
-        <w:t>The project achieved its core software objective: a role-aware monitoring platform now connects authentication, assigned-patient switching, clinical data, medications, alerts, reports, notifications, live updates, AI assistance and restricted research functions. Patient scope is enforced on the server, and administrators are not given unrestricted clinical visibility. PostgreSQL and migrations provide durable ownership, while Redis/WebSocket and polling balance immediacy with recovery. The work therefore demonstrates that a final-year prototype can extend beyond a visual dashboard into an auditable workflow system.</w:t>
+        <w:t>The first research question asked how a full-stack dashboard could support continuous monitoring while preserving role and patient boundaries. The completed software shows that this requires more than hiding navigation items. Access is derived from authenticated identity and active patient-staff assignments on the server, while inaccessible patient identifiers return 404. This matters because a visually correct frontend cannot prevent a user from calling an API directly. The negative access tests therefore provide stronger evidence than screenshots alone: they test the authority boundary on which confidentiality depends.</w:t>
       </w:r>
     </w:p>
     <w:p>
@@ -4914,7 +5803,15 @@
         <w:widowControl/>
       </w:pPr>
       <w:r>
-        <w:t>The AI objective was met in a bounded sense. Responses are structured, evidence-linked and validated, memory is patient-specific and encrypted, prompt content is untrusted, and critical status is deterministic. These controls materially improve reliability compared with a free-text chatbot. Nevertheless, validation cannot guarantee that every recommendation is clinically appropriate. Provider governance, clinical review and scenario expansion remain necessary.</w:t>
+        <w:t>The persistence and messaging results also explain why the architecture combines PostgreSQL, WebSockets and Redis rather than treating them as interchangeable technologies. PostgreSQL retains the authoritative notification and clinical state; WebSockets reduce the delay before the interface refreshes; Redis distributes invalidation messages when multiple backend instances are used. This layered approach accepts that a socket may disconnect and that Redis may be unavailable without allowing an alert record to disappear. It is consistent with the literature's broader warning that remote monitoring is a service and workflow problem, not simply a device-streaming problem (Lu et al., 2023).</w:t>
+      </w:r>
+    </w:p>
+    <w:p>
+      <w:pPr>
+        <w:widowControl/>
+      </w:pPr>
+      <w:r>
+        <w:t>The result is a substantial engineering prototype, but not evidence of operational reliability at clinical scale. The 50 passing backend tests cover defined API and safety scenarios, while the failed final Playwright rerun shows that browser-level assurance is currently incomplete. Neither suite represents every concurrent request, network partition or managed-service failure. Backup and verification scripts demonstrate a recovery mechanism, but only a recorded restoration exercise would demonstrate recoverability. The correct interpretation is therefore that the architecture implements defensible controls and testable failure behaviour, while production assurance remains incomplete.</w:t>
       </w:r>
     </w:p>
     <w:p>
@@ -4922,7 +5819,7 @@
         <w:pStyle w:val="Heading2"/>
       </w:pPr>
       <w:r>
-        <w:t>7.3 Interpretation of Predictive Performance</w:t>
+        <w:t>7.3 Research Question Two: Predicting a Six-Hour Critical Event</w:t>
       </w:r>
     </w:p>
     <w:p>
@@ -4930,7 +5827,7 @@
         <w:widowControl/>
       </w:pPr>
       <w:r>
-        <w:t>The classifier ranks risk better than chance in both internal and related external data, and sensitivity remains stable. However, the chosen operating threshold converts this discrimination into many false positives. At 3.77% precision on the test set, live alerts could create substantial fatigue. The appropriate conclusion is not to tune for an attractive headline metric after observing the test set. The system should remain in shadow mode while local outcome prevalence, alert burden, repeated-confirmation rules and clinician-defined costs are measured prospectively.</w:t>
+        <w:t>The second research question concerned whether longitudinal measurements could support a six-hour prediction. The internal ROC-AUC of 0.833 and Set B ROC-AUC of 0.785 show that the classifier ranked positive observations above negative observations more often than chance in both retrospective cohorts. The decrease on Set B is important: it indicates that performance is sensitive even to a related-cohort change. It would be methodologically unsound to treat the internal value as a stable property of the model or compare it directly with studies using different outcomes, populations or prediction horizons. This interpretation follows TRIPOD+AI's emphasis on clearly defined populations, outcomes and evaluation settings (Collins et al., 2024).</w:t>
       </w:r>
     </w:p>
     <w:p>
@@ -4938,7 +5835,31 @@
         <w:widowControl/>
       </w:pPr>
       <w:r>
-        <w:t>The ICU-to-outpatient gap is equally important. PhysioNet provides genuine longitudinal vitals and a reproducible research base, but it does not contain the ordinary smartwatch activity context assumed by parts of the dashboard. Missing activity fields were correctly left absent. A compatible outpatient cohort must be validated without retraining first to reveal dataset shift, followed by a pre-specified decision on recalibration or redevelopment. Until then, the model is experimental decision support rather than a general wearable-risk engine.</w:t>
+        <w:t>The apparent tension between useful ROC-AUC and very low precision is explained by class imbalance and threshold choice. Only 76 of 5,600 internal test observations were positive, an event prevalence of approximately 1.36%. At the 0.014 operating threshold, the model identified 55 of those events but also produced 1,403 false positives. Sensitivity was therefore 72.4%, while only 3.77% of positive predictions corresponded to the defined event. ROC-AUC describes ranking across possible thresholds; it does not describe the workload created by the deployed threshold. PR-AUC and the confusion matrix are consequently more informative for the practical alerting question.</w:t>
+      </w:r>
+    </w:p>
+    <w:p>
+      <w:pPr>
+        <w:widowControl/>
+      </w:pPr>
+      <w:r>
+        <w:t>The low threshold was not an accidental coding value. It resulted from a validation rule that first required sensitivity of at least 0.70 and then maximised Youden's J. That choice reflects a preference for missing fewer future critical events, but the test results reveal its cost. Ancker et al. (2017) show why repeated low-value alerts can reduce responsiveness; in this project, the precision result turns that literature concern into a concrete design constraint. Consecutive-positive confirmation, trend confirmation, cooldown and shadow mode can reduce visible alert volume, but their clinical effect has not been measured. They should therefore be evaluated prospectively rather than assumed to solve alert fatigue.</w:t>
+      </w:r>
+    </w:p>
+    <w:p>
+      <w:pPr>
+        <w:widowControl/>
+      </w:pPr>
+      <w:r>
+        <w:t>The calibration result also requires cautious interpretation. A Brier score of 0.012 appears low, but rare-event prevalence allows low scores even when positive predictions are operationally problematic. The calibration curve is more informative because it compares predicted and observed frequencies across probability groups. Sigmoid calibration improves the relationship between model scores and probabilities within the validation setting; it cannot correct an ICU-to-outpatient population shift by itself.</w:t>
+      </w:r>
+    </w:p>
+    <w:p>
+      <w:pPr>
+        <w:widowControl/>
+      </w:pPr>
+      <w:r>
+        <w:t>The PhysioNet dataset was appropriate for a reproducible retrospective experiment because it contains longitudinal ICU observations and genuine future events. It is nevertheless poorly matched to the product's wearable and outpatient concept. Activity and sleep variables absent from the source were not invented during training, so the fitted model cannot validate claims about those signals. The next scientifically useful step is external validation on a licensed, representative outpatient or wearable cohort before retraining. A large performance drop would not make the project a failure; it would quantify the generalisation limitation that the present evidence already suggests.</w:t>
       </w:r>
     </w:p>
     <w:p>
@@ -4946,7 +5867,7 @@
         <w:pStyle w:val="Heading2"/>
       </w:pPr>
       <w:r>
-        <w:t>7.4 Contribution of the Project</w:t>
+        <w:t>7.4 Research Question Three: Combining ML, Groq and Safety Rules</w:t>
       </w:r>
     </w:p>
     <w:p>
@@ -4954,7 +5875,7 @@
         <w:widowControl/>
       </w:pPr>
       <w:r>
-        <w:t>The principal contribution is the integration of safeguards across layers. Deterministic thresholds, a versioned model, SHAP, strict AI schemas, assignment-scoped APIs, durable notifications, governance controls and research evidence are not isolated demonstrations. They form a coherent boundary between care, experiment and administration. The research workspace makes absent evidence visible: zero usability sessions or unadjudicated predictions remain zero rather than becoming a narrative claim.</w:t>
+        <w:t>The third research question asked how prediction and generative assistance could be integrated without allowing either to replace deterministic safety. The implementation provides a clear answer at the software level. Extreme measured values are evaluated before model inference or Groq generation. The six-hour model supplies a probability for a defined future event. Groq supplies structured language generated by a pre-trained external model. These components have different purposes and evidence bases, so the separation prevents a provider outage or malformed response from suppressing an urgent threshold alert.</w:t>
       </w:r>
     </w:p>
     <w:p>
@@ -4962,7 +5883,15 @@
         <w:widowControl/>
       </w:pPr>
       <w:r>
-        <w:t>A second contribution is the transparent treatment of failure. CORS, CSP, 401/404 responses, database startup, WebSocket lifecycle, test-account pollution, credential exposure and accessibility defects were recorded as design evidence. This strengthens the dissertation because mature software engineering is demonstrated through diagnosis and prevention, not through pretending that the first implementation was correct.</w:t>
+        <w:t>The assistant tests show that schema validation, controlled evidence identifiers, timestamp checks and rejection of provider-generated Critical classifications can constrain known failure modes. This is meaningful because medical LLM studies report impressive question-answering capability alongside unresolved grounding, harm and bias concerns (Singhal et al., 2023; Lee, Bubeck and Petro, 2023). However, passing constructed safety scenarios does not demonstrate that every clinically important hallucination will be detected. The evidence-support indicator describes agreement with retrieved records; it is not a calibrated probability that the answer is medically correct.</w:t>
+      </w:r>
+    </w:p>
+    <w:p>
+      <w:pPr>
+        <w:widowControl/>
+      </w:pPr>
+      <w:r>
+        <w:t>Patient-specific encrypted memory and clearing the previous patient's stored conversation on a patient switch reduce cross-patient contamination risk. They do not prove resistance to every concurrency, key-management or compromised-account scenario. Similarly, prompt delimiters and instructions make patient text less able to control the model, but no prompt-injection defence can be treated as absolute. The assistant is therefore best interpreted as an evidence-navigation aid whose outputs require user review, consistent with WHO's emphasis on human autonomy, transparency and accountability (World Health Organization, 2021).</w:t>
       </w:r>
     </w:p>
     <w:p>
@@ -4970,7 +5899,7 @@
         <w:pStyle w:val="Heading2"/>
       </w:pPr>
       <w:r>
-        <w:t>7.5 Remaining Risks</w:t>
+        <w:t>7.5 Research Question Four: Usability, Accessibility and Governance</w:t>
       </w:r>
     </w:p>
     <w:p>
@@ -4978,7 +5907,23 @@
         <w:widowControl/>
       </w:pPr>
       <w:r>
-        <w:t>The most immediate risk is alert burden. Additional risks include device measurement error, missingness, organisational response capacity, provider availability, biased subgroup performance, incomplete terminology integration and accidental misinterpretation of AI language. Operational readiness also depends on secure secrets, backups, restoration testing, monitoring and incident ownership. These are controllable only through continuing process and evidence, not a one-time code change.</w:t>
+        <w:t>The fourth research question concerned whether the system could expose its state and limitations clearly enough to support responsible study. The interface distinguishes unread notifications from retained history, probability from confidence, synthetic demonstration data from the training cohort, and absent evidence from a completed study. These distinctions matter because misleading terminology can alter user trust even when the underlying calculation is correct. The research workspace extends this principle by storing zero completed sessions or unadjudicated outcomes as missing evidence rather than converting infrastructure into a result.</w:t>
+      </w:r>
+    </w:p>
+    <w:p>
+      <w:pPr>
+        <w:widowControl/>
+      </w:pPr>
+      <w:r>
+        <w:t>Automated accessibility results provide useful but bounded evidence. Labels, keyboard routes, focus behaviour, reduced motion and 200% zoom can be checked mechanically, whereas comprehension, screen-reader efficiency and clinical workload require human participants. Brooke's (1996) SUS instrument and WCAG 2.2 informed the implemented protocol and interface checks, but no SUS score or formal assistive-technology result is reported. This is an important limitation rather than an unfinished sentence: it prevents the dissertation from confusing technical conformance checks with usability in practice.</w:t>
+      </w:r>
+    </w:p>
+    <w:p>
+      <w:pPr>
+        <w:widowControl/>
+      </w:pPr>
+      <w:r>
+        <w:t>Governance controls similarly prepare rather than complete assurance. Shadow/live selection, threshold settings, drift suspension and approval history make model use observable. The repository contains one committed model artifact, so the active-version control enforces a match but does not yet provide true multi-artifact rollback. DECIDE-AI emphasises that early live evaluation must examine workflow, human factors and safety (Vasey et al., 2022). Those activities remain future work and cannot be replaced by an administrator screen.</w:t>
       </w:r>
     </w:p>
     <w:p>
@@ -4986,7 +5931,7 @@
         <w:pStyle w:val="Heading2"/>
       </w:pPr>
       <w:r>
-        <w:t>7.6 Chapter Summary</w:t>
+        <w:t>7.6 Contribution and Remaining Limitations</w:t>
       </w:r>
     </w:p>
     <w:p>
@@ -4994,7 +5939,39 @@
         <w:widowControl/>
       </w:pPr>
       <w:r>
-        <w:t>The system satisfies its principal engineering aims and offers a defensible foundation for research. Its model and AI capabilities are useful only when interpreted within their constraints. The evidence supports further shadow and prospective evaluation, not autonomous or unsupervised clinical use.</w:t>
+        <w:t>The principal contribution is not a novel clinical algorithm. It is the integration of explicit boundaries across a working full-stack prototype: backend patient scope, durable notification state, deterministic urgent rules, a versioned retrospective classifier, SHAP behaviour evidence, constrained Groq output and a restricted research area. This integration makes it possible to demonstrate where data came from, which component produced a conclusion and what evidence is still missing.</w:t>
+      </w:r>
+    </w:p>
+    <w:p>
+      <w:pPr>
+        <w:widowControl/>
+      </w:pPr>
+      <w:r>
+        <w:t>A second contribution is the documented conversion of failures into controls. CORS and CSP errors exposed deployment assumptions; 401 and 404 responses revealed authentication and route-contract problems; WebSocket lifecycle failures motivated durable-state recovery; test-account pollution exposed weak data lifecycle; and accessibility warnings revealed repeated component defects. Recording these events strengthens the engineering argument because it connects corrective design choices to observed problems rather than presenting the final architecture as inevitable.</w:t>
+      </w:r>
+    </w:p>
+    <w:p>
+      <w:pPr>
+        <w:widowControl/>
+      </w:pPr>
+      <w:r>
+        <w:t>The remaining limitations determine the strength of the conclusion. Low precision prevents a claim of acceptable alert burden. ICU-derived data prevent a claim of outpatient or smartwatch generalisation. Small subgroup event counts prevent a fairness conclusion. Automated testing cannot establish clinical comprehension, effectiveness or safety in use. Provider availability, device error, organisational response capacity, backup restoration and incident ownership remain socio-technical dependencies. No single code change can resolve these limitations; they require approved studies, representative data and operational evidence.</w:t>
+      </w:r>
+    </w:p>
+    <w:p>
+      <w:pPr>
+        <w:pStyle w:val="Heading2"/>
+      </w:pPr>
+      <w:r>
+        <w:t>7.7 Chapter Summary</w:t>
+      </w:r>
+    </w:p>
+    <w:p>
+      <w:pPr>
+        <w:widowControl/>
+      </w:pPr>
+      <w:r>
+        <w:t>The results answer the research questions at the level of a software and retrospective research prototype. The system demonstrates enforceable patient boundaries, recoverable notification design, bounded integration of ML and Groq, and transparent research governance. The model shows useful retrospective discrimination but unacceptable potential alert burden, and the population mismatch prevents the intended wearable interpretation. The evidence therefore supports shadow evaluation and further external validation, not autonomous clinical use, demonstrated effectiveness or regulatory approval.</w:t>
       </w:r>
     </w:p>
     <w:p>
@@ -5138,6 +6115,14 @@
         <w:widowControl/>
       </w:pPr>
       <w:r>
+        <w:t>Ghassemi, M., Oakden-Rayner, L. and Beam, A.L. (2021) ‘The false hope of current approaches to explainable artificial intelligence in health care’, The Lancet Digital Health, 3(11), pp. e745–e750. Available at: https://doi.org/10.1016/S2589-7500(21)00208-9 (Accessed: 19 August 2026).</w:t>
+      </w:r>
+    </w:p>
+    <w:p>
+      <w:pPr>
+        <w:widowControl/>
+      </w:pPr>
+      <w:r>
         <w:t>HL7 International (2019) FHIR Release 4. Available at: https://hl7.org/fhir/R4/ (Accessed: 7 August 2026).</w:t>
       </w:r>
     </w:p>
@@ -5154,6 +6139,14 @@
         <w:widowControl/>
       </w:pPr>
       <w:r>
+        <w:t>Lee, P., Bubeck, S. and Petro, J. (2023) ‘Benefits, limits, and risks of GPT-4 as an AI chatbot for medicine’, New England Journal of Medicine, 388(13), pp. 1233–1239. Available at: https://doi.org/10.1056/NEJMsr2214184 (Accessed: 19 August 2026).</w:t>
+      </w:r>
+    </w:p>
+    <w:p>
+      <w:pPr>
+        <w:widowControl/>
+      </w:pPr>
+      <w:r>
         <w:t>Liu, X. et al. (2020) ‘Reporting guidelines for clinical trial reports for interventions involving artificial intelligence: the CONSORT-AI extension’, BMJ, 370, m3164. Available at: https://doi.org/10.1136/bmj.m3164 (Accessed: 7 August 2026).</w:t>
       </w:r>
     </w:p>
@@ -5170,6 +6163,22 @@
         <w:widowControl/>
       </w:pPr>
       <w:r>
+        <w:t>Lu, J.K., Sijm, M., Janssens, G.E., Goh, J. and Maier, A.B. (2023) ‘Remote monitoring technologies for measuring cardiovascular functions in community-dwelling adults: a systematic review’, GeroScience, 45(5), pp. 2939–2950. Available at: https://doi.org/10.1007/s11357-023-00815-4 (Accessed: 19 August 2026).</w:t>
+      </w:r>
+    </w:p>
+    <w:p>
+      <w:pPr>
+        <w:widowControl/>
+      </w:pPr>
+      <w:r>
+        <w:t>MHRA (2024) Software and AI as a Medical Device Change Programme. Medicines and Healthcare products Regulatory Agency. Available at: https://www.gov.uk/government/publications/software-and-ai-as-a-medical-device-change-programme (Accessed: 19 August 2026).</w:t>
+      </w:r>
+    </w:p>
+    <w:p>
+      <w:pPr>
+        <w:widowControl/>
+      </w:pPr>
+      <w:r>
         <w:t>Niculescu-Mizil, A. and Caruana, R. (2005) ‘Predicting good probabilities with supervised learning’, Proceedings of the 22nd International Conference on Machine Learning, pp. 625–632.</w:t>
       </w:r>
     </w:p>
@@ -5202,6 +6211,14 @@
         <w:widowControl/>
       </w:pPr>
       <w:r>
+        <w:t>Singhal, K. et al. (2023) ‘Large language models encode clinical knowledge’, Nature, 620, pp. 172–180. Available at: https://doi.org/10.1038/s41586-023-06291-2 (Accessed: 19 August 2026).</w:t>
+      </w:r>
+    </w:p>
+    <w:p>
+      <w:pPr>
+        <w:widowControl/>
+      </w:pPr>
+      <w:r>
         <w:t>Silva, I. et al. (2012) ‘Predicting in-hospital mortality of ICU patients: the PhysioNet/Computing in Cardiology Challenge 2012’, Computing in Cardiology, 39, pp. 245–248. Available at: https://physionet.org/content/challenge-2012/1.0.0/ (Accessed: 7 August 2026).</w:t>
       </w:r>
     </w:p>
@@ -5219,6 +6236,14 @@
       </w:pPr>
       <w:r>
         <w:t>Topol, E. (2019) Deep Medicine: How Artificial Intelligence Can Make Healthcare Human Again. New York: Basic Books.</w:t>
+      </w:r>
+    </w:p>
+    <w:p>
+      <w:pPr>
+        <w:widowControl/>
+      </w:pPr>
+      <w:r>
+        <w:t>Vasey, B. et al. (2022) ‘Reporting guideline for the early-stage clinical evaluation of decision support systems driven by artificial intelligence: DECIDE-AI’, BMJ, 377, e070904. Available at: https://doi.org/10.1136/bmj-2022-070904 (Accessed: 19 August 2026).</w:t>
       </w:r>
     </w:p>
     <w:p>
@@ -5341,7 +6366,7 @@
       <w:fldChar w:fldCharType="begin"/>
       <w:instrText xml:space="preserve">PAGE</w:instrText>
       <w:fldChar w:fldCharType="separate"/>
-      <w:t>Update this field in Microsoft Word</w:t>
+      <w:t>1</w:t>
       <w:fldChar w:fldCharType="end"/>
     </w:r>
   </w:p>
@@ -5359,7 +6384,7 @@
       <w:fldChar w:fldCharType="begin"/>
       <w:instrText xml:space="preserve">PAGE</w:instrText>
       <w:fldChar w:fldCharType="separate"/>
-      <w:t>Update this field in Microsoft Word</w:t>
+      <w:t>1</w:t>
       <w:fldChar w:fldCharType="end"/>
     </w:r>
   </w:p>

</xml_diff>